<commit_message>
Rebuild astronomy lessons with teaching templates
</commit_message>
<xml_diff>
--- a/assets/lessons/velocity-curve/hydrogen-21cm.docx
+++ b/assets/lessons/velocity-curve/hydrogen-21cm.docx
@@ -5,7 +5,6 @@
     <w:p>
       <w:pPr>
         <w:pStyle w:val="Title"/>
-        <w:keepNext/>
       </w:pPr>
       <w:r>
         <w:t>The 21 cm hydrogen line</w:t>
@@ -14,96 +13,51 @@
     <w:p>
       <w:pPr>
         <w:pStyle w:val="Subtitle"/>
-        <w:keepNext/>
       </w:pPr>
       <w:r>
-        <w:t>Teaching guide</w:t>
+        <w:t>Reading and calculation</w:t>
       </w:r>
     </w:p>
     <w:p>
       <w:r>
-        <w:t xml:space="preserve">The Milky Way Galaxy, like most, is full of one of the most basic atoms in space - neutral  hydrogen, consisting of one positively charged proton, with a single negatively charged electron  orbiting it. These atoms can emit radio waves at 1420 </w:t>
+        <w:t>Use neutral hydrogen emission to understand what the horn telescope measures. Then calculate the energy of one radio photon.</w:t>
       </w:r>
+    </w:p>
+    <w:p>
+      <w:pPr>
+        <w:pStyle w:val="Heading1"/>
+      </w:pPr>
       <w:r>
-        <w:rPr>
-          <w:i/>
-        </w:rPr>
-        <w:t>MHz</w:t>
-      </w:r>
-      <w:r>
-        <w:t>. Much of the light from the stars in the  galaxy is absorbed by dust clouds in the galaxy. However, the radio waves from hydrogen gas  penetrates the dust clouds, and therefore, they are able to reach us on earth. We can use these radio  signals to get a map of the hydrogen in the galaxy.</w:t>
+        <w:t>A radio view of the Milky Way</w:t>
       </w:r>
     </w:p>
     <w:p>
       <w:r>
-        <w:t xml:space="preserve">The 1420 </w:t>
+        <w:t>A neutral hydrogen atom has one proton and one electron. Hydrogen gas fills much of the space between stars. Its radio emission passes through dust that blocks visible light. We use this emission to map gas across the Milky Way.</w:t>
       </w:r>
+    </w:p>
+    <w:p>
+      <w:pPr>
+        <w:pStyle w:val="Heading1"/>
+      </w:pPr>
       <w:r>
-        <w:rPr>
-          <w:i/>
-        </w:rPr>
-        <w:t>MHz</w:t>
-      </w:r>
-      <w:r>
-        <w:t xml:space="preserve"> radiation comes from the transition between the two slightly different levels of the  hydrogen </w:t>
-      </w:r>
-      <w:r>
-        <w:rPr>
-          <w:i/>
-        </w:rPr>
-        <w:t>1s</w:t>
-      </w:r>
-      <w:r>
-        <w:t xml:space="preserve"> ground state. Both the proton and electron have a property called “</w:t>
-      </w:r>
-      <w:r>
-        <w:rPr>
-          <w:b/>
-          <w:i/>
-        </w:rPr>
-        <w:t>spin</w:t>
-      </w:r>
-      <w:r>
-        <w:t xml:space="preserve">”, which is the  term used to describe a certain quantum mechanical property related to angular momentum. It does  not describe an actual rotation of the proton and electron. (Despite this, the spin property is actually  often visualized as a rotational state of the particle.) There are only 2 possible states of the spin –  either </w:t>
-      </w:r>
-      <w:r>
-        <w:rPr>
-          <w:b/>
-          <w:i/>
-        </w:rPr>
-        <w:t>up</w:t>
-      </w:r>
-      <w:r>
-        <w:t xml:space="preserve"> or </w:t>
-      </w:r>
-      <w:r>
-        <w:rPr>
-          <w:b/>
-          <w:i/>
-        </w:rPr>
-        <w:t>down</w:t>
-      </w:r>
-      <w:r>
-        <w:t>.</w:t>
+        <w:t>How the line forms</w:t>
       </w:r>
     </w:p>
     <w:p>
       <w:r>
-        <w:t xml:space="preserve">The higher energy state of this neutral hydrogen atom occurs when the electron and proton spins are aligned, said to be “parallel”. The electron can spontaneously switch to its opposite spin state, and  the spin states become anti-parallel, which is a lower energy state than the parallel spins. Because of the quantum properties of radiation and the principle of energy conservation, hydrogen in its lower  energy state can absorb a photon with a frequency of 1420.4 MHz to transition to the higher energy  state. Similarly,  hydrogen in its the higher energy state can emit a photon at 1420.4 </w:t>
+        <w:t>The proton and electron have a quantum property called spin. Spin is related to angular momentum; it does not mean literal rotation. Their relative spin orientations give neutral hydrogen two closely spaced ground-state energy levels.</w:t>
       </w:r>
+    </w:p>
+    <w:p>
       <w:r>
-        <w:rPr>
-          <w:i/>
-        </w:rPr>
-        <w:t>MHz</w:t>
-      </w:r>
-      <w:r>
-        <w:t xml:space="preserve"> to  transition to its lower state. These absorbed and emitted radio waves have a wavelength of 21 cm.</w:t>
+        <w:t>Parallel spins correspond to the higher energy level. Antiparallel spins correspond to the lower level. A transition to the lower level releases a photon near 1420.4 MHz, with a wavelength of about 21 cm. Absorbing a photon at this frequency can drive the reverse transition.</w:t>
       </w:r>
     </w:p>
     <w:p>
       <w:pPr>
-        <w:spacing w:before="100" w:after="160"/>
+        <w:keepNext/>
+        <w:spacing w:before="80" w:after="60"/>
         <w:jc w:val="center"/>
       </w:pPr>
       <w:r>
@@ -111,10 +65,10 @@
           <w:noProof/>
         </w:rPr>
         <w:drawing>
-          <wp:inline distT="0" distB="0" distL="0" distR="0" wp14:anchorId="1FF291F3" wp14:editId="37D5D0D3">
-            <wp:extent cx="5613400" cy="1971040"/>
+          <wp:inline distT="0" distB="0" distL="0" distR="0">
+            <wp:extent cx="5212080" cy="1830124"/>
             <wp:effectExtent l="0" t="0" r="0" b="0"/>
-            <wp:docPr id="1" name="Picture 1" descr="The 21 cm hydrogen line illustration"/>
+            <wp:docPr id="1" name="Picture 1" descr="Hydrogen releases a radio photon when it changes to the lower energy state."/>
             <wp:cNvGraphicFramePr>
               <a:graphicFrameLocks xmlns:a="http://schemas.openxmlformats.org/drawingml/2006/main" noChangeAspect="1"/>
             </wp:cNvGraphicFramePr>
@@ -122,7 +76,7 @@
               <a:graphicData uri="http://schemas.openxmlformats.org/drawingml/2006/picture">
                 <pic:pic xmlns:pic="http://schemas.openxmlformats.org/drawingml/2006/picture">
                   <pic:nvPicPr>
-                    <pic:cNvPr id="0" name="hydrogen-21cm-1-1.png"/>
+                    <pic:cNvPr id="0" name="image1.png"/>
                     <pic:cNvPicPr/>
                   </pic:nvPicPr>
                   <pic:blipFill>
@@ -134,7 +88,7 @@
                   <pic:spPr>
                     <a:xfrm>
                       <a:off x="0" y="0"/>
-                      <a:ext cx="5613400" cy="1971040"/>
+                      <a:ext cx="5212080" cy="1830124"/>
                     </a:xfrm>
                     <a:prstGeom prst="rect">
                       <a:avLst/>
@@ -148,53 +102,70 @@
       </w:r>
     </w:p>
     <w:p>
+      <w:pPr>
+        <w:pStyle w:val="Caption"/>
+        <w:jc w:val="center"/>
+      </w:pPr>
       <w:r>
-        <w:t>The FM radio in your car tunes to signals with frequencies between 87 MHz and 107 MHz. If you  could tune your car radio all the way up to 1420.5MHz, you would be able to listen to the neutral  hydrogen in our galaxy. The horn telescope is specifically designed to detect signals with  frequencies around 1420 MHz, optimal for detecting the hydrogen radio signals from our galaxy.</w:t>
+        <w:t>Hydrogen releases a radio photon when it changes to the lower energy state.</w:t>
+      </w:r>
+    </w:p>
+    <w:p>
+      <w:r>
+        <w:t>The horn telescope measures signals near this frequency. Motion along our line of sight shifts the observed frequency through the Doppler effect.</w:t>
+      </w:r>
+    </w:p>
+    <w:p>
+      <w:pPr>
+        <w:pStyle w:val="Heading1"/>
+      </w:pPr>
+      <w:r>
+        <w:t>Calculate the photon energy</w:t>
+      </w:r>
+    </w:p>
+    <w:p>
+      <w:r>
+        <w:t>Use E = hf, where E is photon energy, h is Planck’s constant, and f is frequency.</w:t>
+      </w:r>
+    </w:p>
+    <w:p>
+      <w:pPr>
+        <w:pStyle w:val="ListNumber"/>
+        <w:numPr>
+          <w:ilvl w:val="0"/>
+          <w:numId w:val="10"/>
+        </w:numPr>
+      </w:pPr>
+      <w:r>
+        <w:t>Look up Planck’s constant in joule-seconds. Convert 1420.4 MHz to hertz.</w:t>
+      </w:r>
+    </w:p>
+    <w:p>
+      <w:pPr>
+        <w:pStyle w:val="ListNumber"/>
+        <w:numPr>
+          <w:ilvl w:val="0"/>
+          <w:numId w:val="10"/>
+        </w:numPr>
+      </w:pPr>
+      <w:r>
+        <w:t>Calculate the photon energy in joules. Show your units and working.</w:t>
       </w:r>
     </w:p>
     <w:p>
       <w:r>
         <w:rPr>
-          <w:b/>
+          <w:color w:val="7F7F7F"/>
         </w:rPr>
-        <w:t>Exercise:</w:t>
-      </w:r>
-      <w:r>
-        <w:t xml:space="preserve"> The energy of a photon is directly proportional to its frequency, </w:t>
-      </w:r>
-      <w:r>
-        <w:rPr>
-          <w:i/>
-        </w:rPr>
-        <w:t>f</w:t>
-      </w:r>
-      <w:r>
-        <w:t>, through the relationship:</w:t>
+        <w:t>________________________________________________________________________</w:t>
       </w:r>
     </w:p>
     <w:p>
       <w:r>
-        <w:t>E</w:t>
-      </w:r>
-      <w:r>
         <w:rPr>
-          <w:vertAlign w:val="subscript"/>
+          <w:color w:val="7F7F7F"/>
         </w:rPr>
-        <w:t>photon</w:t>
-      </w:r>
-      <w:r>
-        <w:t xml:space="preserve"> = h</w:t>
-      </w:r>
-      <w:r>
-        <w:rPr>
-          <w:i/>
-        </w:rPr>
-        <w:t>f</w:t>
-      </w:r>
-    </w:p>
-    <w:p>
-      <w:r>
-        <w:t>where h = Planck's constant. Look up the value of Planck's constant and calculate the energy of the  photon emitted during the spin flip transition in neutral hydrogen. Express your answer in joules.</w:t>
+        <w:t>________________________________________________________________________</w:t>
       </w:r>
     </w:p>
     <w:sectPr>
@@ -205,7 +176,7 @@
       <w:headerReference w:type="first" r:id="rId13"/>
       <w:footerReference w:type="first" r:id="rId14"/>
       <w:pgSz w:w="12240" w:h="15840"/>
-      <w:pgMar w:top="1512" w:right="1080" w:bottom="1080" w:left="1080" w:header="432" w:footer="432" w:gutter="0"/>
+      <w:pgMar w:top="1512" w:right="1080" w:bottom="1008" w:left="1080" w:header="432" w:footer="432" w:gutter="0"/>
       <w:cols w:space="720"/>
       <w:docGrid w:linePitch="360"/>
     </w:sectPr>
@@ -563,32 +534,38 @@
       </w:rPr>
     </w:lvl>
   </w:abstractNum>
-  <w:num w:numId="1" w16cid:durableId="268659679">
+  <w:num w:numId="1" w16cid:durableId="2013213653">
     <w:abstractNumId w:val="8"/>
   </w:num>
-  <w:num w:numId="2" w16cid:durableId="661201435">
+  <w:num w:numId="2" w16cid:durableId="1314718113">
     <w:abstractNumId w:val="6"/>
   </w:num>
-  <w:num w:numId="3" w16cid:durableId="883640105">
+  <w:num w:numId="3" w16cid:durableId="561213874">
     <w:abstractNumId w:val="5"/>
   </w:num>
-  <w:num w:numId="4" w16cid:durableId="802770270">
+  <w:num w:numId="4" w16cid:durableId="637957408">
     <w:abstractNumId w:val="4"/>
   </w:num>
-  <w:num w:numId="5" w16cid:durableId="234558732">
+  <w:num w:numId="5" w16cid:durableId="904952620">
     <w:abstractNumId w:val="7"/>
   </w:num>
-  <w:num w:numId="6" w16cid:durableId="911962301">
+  <w:num w:numId="6" w16cid:durableId="1595548113">
     <w:abstractNumId w:val="3"/>
   </w:num>
-  <w:num w:numId="7" w16cid:durableId="2517598">
+  <w:num w:numId="7" w16cid:durableId="1391727043">
     <w:abstractNumId w:val="2"/>
   </w:num>
-  <w:num w:numId="8" w16cid:durableId="274287364">
+  <w:num w:numId="8" w16cid:durableId="926695197">
     <w:abstractNumId w:val="1"/>
   </w:num>
-  <w:num w:numId="9" w16cid:durableId="414673181">
+  <w:num w:numId="9" w16cid:durableId="533272150">
     <w:abstractNumId w:val="0"/>
+  </w:num>
+  <w:num w:numId="10" w16cid:durableId="1051615676">
+    <w:abstractNumId w:val="7"/>
+    <w:lvlOverride w:ilvl="0">
+      <w:startOverride w:val="1"/>
+    </w:lvlOverride>
   </w:num>
 </w:numbering>
 </file>
@@ -598,7 +575,7 @@
   <w:docDefaults>
     <w:rPrDefault>
       <w:rPr>
-        <w:rFonts w:ascii="Arial" w:eastAsia="Arial" w:hAnsi="Arial" w:cs="Arial"/>
+        <w:rFonts w:asciiTheme="minorHAnsi" w:eastAsiaTheme="minorEastAsia" w:hAnsiTheme="minorHAnsi" w:cstheme="minorBidi"/>
         <w:sz w:val="22"/>
         <w:szCs w:val="22"/>
         <w:lang w:val="en-US" w:eastAsia="en-US" w:bidi="ar-SA"/>
@@ -987,6 +964,7 @@
       <w:spacing w:after="140" w:line="264" w:lineRule="auto"/>
     </w:pPr>
     <w:rPr>
+      <w:rFonts w:ascii="Arial" w:hAnsi="Arial"/>
       <w:color w:val="000000"/>
     </w:rPr>
   </w:style>
@@ -1074,7 +1052,6 @@
       <w:bCs/>
       <w:i/>
       <w:iCs/>
-      <w:color w:val="4F81BD" w:themeColor="accent1"/>
     </w:rPr>
   </w:style>
   <w:style w:type="paragraph" w:styleId="Heading5">
@@ -1093,9 +1070,6 @@
       <w:spacing w:before="200" w:after="0"/>
       <w:outlineLvl w:val="4"/>
     </w:pPr>
-    <w:rPr>
-      <w:color w:val="243F60" w:themeColor="accent1" w:themeShade="7F"/>
-    </w:rPr>
   </w:style>
   <w:style w:type="paragraph" w:styleId="Heading6">
     <w:name w:val="heading 6"/>
@@ -1116,7 +1090,6 @@
     <w:rPr>
       <w:i/>
       <w:iCs/>
-      <w:color w:val="243F60" w:themeColor="accent1" w:themeShade="7F"/>
     </w:rPr>
   </w:style>
   <w:style w:type="paragraph" w:styleId="Heading7">
@@ -1138,7 +1111,6 @@
     <w:rPr>
       <w:i/>
       <w:iCs/>
-      <w:color w:val="404040" w:themeColor="text1" w:themeTint="BF"/>
     </w:rPr>
   </w:style>
   <w:style w:type="paragraph" w:styleId="Heading8">
@@ -1158,7 +1130,6 @@
       <w:outlineLvl w:val="7"/>
     </w:pPr>
     <w:rPr>
-      <w:color w:val="4F81BD" w:themeColor="accent1"/>
       <w:sz w:val="20"/>
       <w:szCs w:val="20"/>
     </w:rPr>
@@ -1182,7 +1153,6 @@
     <w:rPr>
       <w:i/>
       <w:iCs/>
-      <w:color w:val="404040" w:themeColor="text1" w:themeTint="BF"/>
       <w:sz w:val="20"/>
       <w:szCs w:val="20"/>
     </w:rPr>
@@ -1232,7 +1202,8 @@
     <w:uiPriority w:val="99"/>
     <w:rsid w:val="00E618BF"/>
     <w:rPr>
-      <w:rFonts w:ascii="Arial" w:eastAsia="Arial" w:hAnsi="Arial" w:cs="Arial"/>
+      <w:rFonts w:ascii="Arial" w:hAnsi="Arial"/>
+      <w:color w:val="000000"/>
     </w:rPr>
   </w:style>
   <w:style w:type="paragraph" w:styleId="Footer">
@@ -1256,7 +1227,8 @@
     <w:uiPriority w:val="99"/>
     <w:rsid w:val="00E618BF"/>
     <w:rPr>
-      <w:rFonts w:ascii="Arial" w:eastAsia="Arial" w:hAnsi="Arial" w:cs="Arial"/>
+      <w:rFonts w:ascii="Arial" w:hAnsi="Arial"/>
+      <w:color w:val="000000"/>
     </w:rPr>
   </w:style>
   <w:style w:type="paragraph" w:styleId="NoSpacing">
@@ -1267,6 +1239,10 @@
     <w:pPr>
       <w:spacing w:after="0" w:line="240" w:lineRule="auto"/>
     </w:pPr>
+    <w:rPr>
+      <w:rFonts w:ascii="Arial" w:hAnsi="Arial"/>
+      <w:color w:val="000000"/>
+    </w:rPr>
   </w:style>
   <w:style w:type="character" w:customStyle="1" w:styleId="Heading1Char">
     <w:name w:val="Heading 1 Char"/>
@@ -1275,10 +1251,11 @@
     <w:uiPriority w:val="9"/>
     <w:rsid w:val="00FC693F"/>
     <w:rPr>
+      <w:rFonts w:ascii="Arial" w:hAnsi="Arial"/>
       <w:b/>
       <w:bCs/>
       <w:color w:val="000000"/>
-      <w:sz w:val="30"/>
+      <w:sz w:val="28"/>
       <w:szCs w:val="28"/>
     </w:rPr>
   </w:style>
@@ -1289,10 +1266,11 @@
     <w:uiPriority w:val="9"/>
     <w:rsid w:val="00FC693F"/>
     <w:rPr>
+      <w:rFonts w:ascii="Arial" w:hAnsi="Arial"/>
       <w:b/>
       <w:bCs/>
       <w:color w:val="000000"/>
-      <w:sz w:val="24"/>
+      <w:sz w:val="26"/>
       <w:szCs w:val="26"/>
     </w:rPr>
   </w:style>
@@ -1303,6 +1281,7 @@
     <w:uiPriority w:val="9"/>
     <w:rsid w:val="00FC693F"/>
     <w:rPr>
+      <w:rFonts w:ascii="Arial" w:hAnsi="Arial"/>
       <w:b/>
       <w:bCs/>
       <w:color w:val="000000"/>
@@ -1317,7 +1296,7 @@
     <w:qFormat/>
     <w:rsid w:val="00FC693F"/>
     <w:pPr>
-      <w:spacing w:after="160" w:line="240" w:lineRule="auto"/>
+      <w:spacing w:line="240" w:lineRule="auto"/>
       <w:contextualSpacing/>
     </w:pPr>
     <w:rPr>
@@ -1333,9 +1312,10 @@
     <w:uiPriority w:val="10"/>
     <w:rsid w:val="00FC693F"/>
     <w:rPr>
+      <w:rFonts w:ascii="Arial" w:hAnsi="Arial"/>
       <w:color w:val="000000"/>
       <w:kern w:val="28"/>
-      <w:sz w:val="48"/>
+      <w:sz w:val="52"/>
       <w:szCs w:val="52"/>
     </w:rPr>
   </w:style>
@@ -1351,7 +1331,6 @@
       <w:numPr>
         <w:ilvl w:val="1"/>
       </w:numPr>
-      <w:spacing w:after="160"/>
     </w:pPr>
     <w:rPr>
       <w:iCs/>
@@ -1365,8 +1344,11 @@
     <w:uiPriority w:val="11"/>
     <w:rsid w:val="00FC693F"/>
     <w:rPr>
+      <w:rFonts w:ascii="Arial" w:hAnsi="Arial"/>
+      <w:i/>
       <w:iCs/>
       <w:color w:val="000000"/>
+      <w:sz w:val="24"/>
       <w:szCs w:val="24"/>
     </w:rPr>
   </w:style>
@@ -1399,7 +1381,8 @@
     <w:uiPriority w:val="99"/>
     <w:rsid w:val="00AA1D8D"/>
     <w:rPr>
-      <w:rFonts w:ascii="Arial" w:eastAsia="Arial" w:hAnsi="Arial" w:cs="Arial"/>
+      <w:rFonts w:ascii="Arial" w:hAnsi="Arial"/>
+      <w:color w:val="000000"/>
     </w:rPr>
   </w:style>
   <w:style w:type="paragraph" w:styleId="BodyText2">
@@ -1420,7 +1403,8 @@
     <w:uiPriority w:val="99"/>
     <w:rsid w:val="00AA1D8D"/>
     <w:rPr>
-      <w:rFonts w:ascii="Arial" w:eastAsia="Arial" w:hAnsi="Arial" w:cs="Arial"/>
+      <w:rFonts w:ascii="Arial" w:hAnsi="Arial"/>
+      <w:color w:val="000000"/>
     </w:rPr>
   </w:style>
   <w:style w:type="paragraph" w:styleId="BodyText3">
@@ -1445,7 +1429,8 @@
     <w:uiPriority w:val="99"/>
     <w:rsid w:val="00AA1D8D"/>
     <w:rPr>
-      <w:rFonts w:ascii="Arial" w:eastAsia="Arial" w:hAnsi="Arial" w:cs="Arial"/>
+      <w:rFonts w:ascii="Arial" w:hAnsi="Arial"/>
+      <w:color w:val="000000"/>
       <w:sz w:val="16"/>
       <w:szCs w:val="16"/>
     </w:rPr>
@@ -1615,6 +1600,8 @@
       </w:tabs>
     </w:pPr>
     <w:rPr>
+      <w:rFonts w:ascii="Arial" w:hAnsi="Arial"/>
+      <w:color w:val="000000"/>
       <w:sz w:val="20"/>
       <w:szCs w:val="20"/>
     </w:rPr>
@@ -1626,7 +1613,8 @@
     <w:uiPriority w:val="99"/>
     <w:rsid w:val="0029639D"/>
     <w:rPr>
-      <w:rFonts w:ascii="Arial" w:eastAsia="Arial" w:hAnsi="Arial" w:cs="Arial"/>
+      <w:rFonts w:ascii="Arial" w:hAnsi="Arial"/>
+      <w:color w:val="000000"/>
       <w:sz w:val="20"/>
       <w:szCs w:val="20"/>
     </w:rPr>
@@ -1642,7 +1630,6 @@
     <w:rPr>
       <w:i/>
       <w:iCs/>
-      <w:color w:val="000000" w:themeColor="text1"/>
     </w:rPr>
   </w:style>
   <w:style w:type="character" w:customStyle="1" w:styleId="QuoteChar">
@@ -1652,10 +1639,10 @@
     <w:uiPriority w:val="29"/>
     <w:rsid w:val="00FC693F"/>
     <w:rPr>
-      <w:rFonts w:ascii="Arial" w:eastAsia="Arial" w:hAnsi="Arial" w:cs="Arial"/>
+      <w:rFonts w:ascii="Arial" w:hAnsi="Arial"/>
       <w:i/>
       <w:iCs/>
-      <w:color w:val="000000" w:themeColor="text1"/>
+      <w:color w:val="000000"/>
     </w:rPr>
   </w:style>
   <w:style w:type="character" w:customStyle="1" w:styleId="Heading4Char">
@@ -1666,12 +1653,12 @@
     <w:semiHidden/>
     <w:rsid w:val="00FC693F"/>
     <w:rPr>
-      <w:rFonts w:ascii="Arial" w:eastAsia="Arial" w:hAnsi="Arial" w:cs="Arial"/>
+      <w:rFonts w:ascii="Arial" w:hAnsi="Arial"/>
       <w:b/>
       <w:bCs/>
       <w:i/>
       <w:iCs/>
-      <w:color w:val="4F81BD" w:themeColor="accent1"/>
+      <w:color w:val="000000"/>
     </w:rPr>
   </w:style>
   <w:style w:type="character" w:customStyle="1" w:styleId="Heading5Char">
@@ -1682,8 +1669,8 @@
     <w:semiHidden/>
     <w:rsid w:val="00FC693F"/>
     <w:rPr>
-      <w:rFonts w:ascii="Arial" w:eastAsia="Arial" w:hAnsi="Arial" w:cs="Arial"/>
-      <w:color w:val="243F60" w:themeColor="accent1" w:themeShade="7F"/>
+      <w:rFonts w:ascii="Arial" w:hAnsi="Arial"/>
+      <w:color w:val="000000"/>
     </w:rPr>
   </w:style>
   <w:style w:type="character" w:customStyle="1" w:styleId="Heading6Char">
@@ -1694,10 +1681,10 @@
     <w:semiHidden/>
     <w:rsid w:val="00FC693F"/>
     <w:rPr>
-      <w:rFonts w:ascii="Arial" w:eastAsia="Arial" w:hAnsi="Arial" w:cs="Arial"/>
+      <w:rFonts w:ascii="Arial" w:hAnsi="Arial"/>
       <w:i/>
       <w:iCs/>
-      <w:color w:val="243F60" w:themeColor="accent1" w:themeShade="7F"/>
+      <w:color w:val="000000"/>
     </w:rPr>
   </w:style>
   <w:style w:type="character" w:customStyle="1" w:styleId="Heading7Char">
@@ -1708,10 +1695,10 @@
     <w:semiHidden/>
     <w:rsid w:val="00FC693F"/>
     <w:rPr>
-      <w:rFonts w:ascii="Arial" w:eastAsia="Arial" w:hAnsi="Arial" w:cs="Arial"/>
+      <w:rFonts w:ascii="Arial" w:hAnsi="Arial"/>
       <w:i/>
       <w:iCs/>
-      <w:color w:val="404040" w:themeColor="text1" w:themeTint="BF"/>
+      <w:color w:val="000000"/>
     </w:rPr>
   </w:style>
   <w:style w:type="character" w:customStyle="1" w:styleId="Heading8Char">
@@ -1722,8 +1709,8 @@
     <w:semiHidden/>
     <w:rsid w:val="00FC693F"/>
     <w:rPr>
-      <w:rFonts w:ascii="Arial" w:eastAsia="Arial" w:hAnsi="Arial" w:cs="Arial"/>
-      <w:color w:val="4F81BD" w:themeColor="accent1"/>
+      <w:rFonts w:ascii="Arial" w:hAnsi="Arial"/>
+      <w:color w:val="000000"/>
       <w:sz w:val="20"/>
       <w:szCs w:val="20"/>
     </w:rPr>
@@ -1736,10 +1723,10 @@
     <w:semiHidden/>
     <w:rsid w:val="00FC693F"/>
     <w:rPr>
-      <w:rFonts w:ascii="Arial" w:eastAsia="Arial" w:hAnsi="Arial" w:cs="Arial"/>
+      <w:rFonts w:ascii="Arial" w:hAnsi="Arial"/>
       <w:i/>
       <w:iCs/>
-      <w:color w:val="404040" w:themeColor="text1" w:themeTint="BF"/>
+      <w:color w:val="000000"/>
       <w:sz w:val="20"/>
       <w:szCs w:val="20"/>
     </w:rPr>
@@ -1757,6 +1744,7 @@
       <w:spacing w:line="240" w:lineRule="auto"/>
     </w:pPr>
     <w:rPr>
+      <w:b/>
       <w:bCs/>
       <w:sz w:val="20"/>
       <w:szCs w:val="18"/>
@@ -1769,9 +1757,10 @@
     <w:qFormat/>
     <w:rsid w:val="00FC693F"/>
     <w:rPr>
-      <w:rFonts w:ascii="Arial" w:eastAsia="Arial" w:hAnsi="Arial" w:cs="Arial"/>
+      <w:rFonts w:ascii="Arial" w:hAnsi="Arial"/>
       <w:b/>
       <w:bCs/>
+      <w:color w:val="000000"/>
     </w:rPr>
   </w:style>
   <w:style w:type="character" w:styleId="Emphasis">
@@ -1781,9 +1770,10 @@
     <w:qFormat/>
     <w:rsid w:val="00FC693F"/>
     <w:rPr>
-      <w:rFonts w:ascii="Arial" w:eastAsia="Arial" w:hAnsi="Arial" w:cs="Arial"/>
+      <w:rFonts w:ascii="Arial" w:hAnsi="Arial"/>
       <w:i/>
       <w:iCs/>
+      <w:color w:val="000000"/>
     </w:rPr>
   </w:style>
   <w:style w:type="paragraph" w:styleId="IntenseQuote">
@@ -1795,6 +1785,9 @@
     <w:qFormat/>
     <w:rsid w:val="00FC693F"/>
     <w:pPr>
+      <w:pBdr>
+        <w:bottom w:val="single" w:sz="4" w:space="4" w:color="4F81BD" w:themeColor="accent1"/>
+      </w:pBdr>
       <w:spacing w:before="200" w:after="280"/>
       <w:ind w:left="936" w:right="936"/>
     </w:pPr>
@@ -1803,7 +1796,6 @@
       <w:bCs/>
       <w:i/>
       <w:iCs/>
-      <w:color w:val="4F81BD" w:themeColor="accent1"/>
     </w:rPr>
   </w:style>
   <w:style w:type="character" w:customStyle="1" w:styleId="IntenseQuoteChar">
@@ -1813,12 +1805,12 @@
     <w:uiPriority w:val="30"/>
     <w:rsid w:val="00FC693F"/>
     <w:rPr>
-      <w:rFonts w:ascii="Arial" w:eastAsia="Arial" w:hAnsi="Arial" w:cs="Arial"/>
+      <w:rFonts w:ascii="Arial" w:hAnsi="Arial"/>
       <w:b/>
       <w:bCs/>
       <w:i/>
       <w:iCs/>
-      <w:color w:val="4F81BD" w:themeColor="accent1"/>
+      <w:color w:val="000000"/>
     </w:rPr>
   </w:style>
   <w:style w:type="character" w:styleId="SubtleEmphasis">
@@ -1828,10 +1820,10 @@
     <w:qFormat/>
     <w:rsid w:val="00FC693F"/>
     <w:rPr>
-      <w:rFonts w:ascii="Arial" w:eastAsia="Arial" w:hAnsi="Arial" w:cs="Arial"/>
+      <w:rFonts w:ascii="Arial" w:hAnsi="Arial"/>
       <w:i/>
       <w:iCs/>
-      <w:color w:val="808080" w:themeColor="text1" w:themeTint="7F"/>
+      <w:color w:val="000000"/>
     </w:rPr>
   </w:style>
   <w:style w:type="character" w:styleId="IntenseEmphasis">
@@ -1841,12 +1833,12 @@
     <w:qFormat/>
     <w:rsid w:val="00FC693F"/>
     <w:rPr>
-      <w:rFonts w:ascii="Arial" w:eastAsia="Arial" w:hAnsi="Arial" w:cs="Arial"/>
+      <w:rFonts w:ascii="Arial" w:hAnsi="Arial"/>
       <w:b/>
       <w:bCs/>
       <w:i/>
       <w:iCs/>
-      <w:color w:val="4F81BD" w:themeColor="accent1"/>
+      <w:color w:val="000000"/>
     </w:rPr>
   </w:style>
   <w:style w:type="character" w:styleId="SubtleReference">
@@ -1856,9 +1848,9 @@
     <w:qFormat/>
     <w:rsid w:val="00FC693F"/>
     <w:rPr>
-      <w:rFonts w:ascii="Arial" w:eastAsia="Arial" w:hAnsi="Arial" w:cs="Arial"/>
+      <w:rFonts w:ascii="Arial" w:hAnsi="Arial"/>
       <w:smallCaps/>
-      <w:color w:val="C0504D" w:themeColor="accent2"/>
+      <w:color w:val="000000"/>
       <w:u w:val="single"/>
     </w:rPr>
   </w:style>
@@ -1869,11 +1861,11 @@
     <w:qFormat/>
     <w:rsid w:val="00FC693F"/>
     <w:rPr>
-      <w:rFonts w:ascii="Arial" w:eastAsia="Arial" w:hAnsi="Arial" w:cs="Arial"/>
+      <w:rFonts w:ascii="Arial" w:hAnsi="Arial"/>
       <w:b/>
       <w:bCs/>
       <w:smallCaps/>
-      <w:color w:val="C0504D" w:themeColor="accent2"/>
+      <w:color w:val="000000"/>
       <w:spacing w:val="5"/>
       <w:u w:val="single"/>
     </w:rPr>
@@ -1885,10 +1877,11 @@
     <w:qFormat/>
     <w:rsid w:val="00FC693F"/>
     <w:rPr>
-      <w:rFonts w:ascii="Arial" w:eastAsia="Arial" w:hAnsi="Arial" w:cs="Arial"/>
+      <w:rFonts w:ascii="Arial" w:hAnsi="Arial"/>
       <w:b/>
       <w:bCs/>
       <w:smallCaps/>
+      <w:color w:val="000000"/>
       <w:spacing w:val="5"/>
     </w:rPr>
   </w:style>
@@ -1948,7 +1941,6 @@
         <w:spacing w:before="0" w:after="0" w:line="240" w:lineRule="auto"/>
       </w:pPr>
       <w:rPr>
-        <w:rFonts w:ascii="Arial" w:eastAsia="Arial" w:hAnsi="Arial" w:cs="Arial"/>
         <w:b/>
         <w:bCs/>
       </w:rPr>
@@ -1969,7 +1961,6 @@
         <w:spacing w:before="0" w:after="0" w:line="240" w:lineRule="auto"/>
       </w:pPr>
       <w:rPr>
-        <w:rFonts w:ascii="Arial" w:eastAsia="Arial" w:hAnsi="Arial" w:cs="Arial"/>
         <w:b/>
         <w:bCs/>
       </w:rPr>
@@ -1987,14 +1978,12 @@
     </w:tblStylePr>
     <w:tblStylePr w:type="firstCol">
       <w:rPr>
-        <w:rFonts w:ascii="Arial" w:eastAsia="Arial" w:hAnsi="Arial" w:cs="Arial"/>
         <w:b/>
         <w:bCs/>
       </w:rPr>
     </w:tblStylePr>
     <w:tblStylePr w:type="lastCol">
       <w:rPr>
-        <w:rFonts w:ascii="Arial" w:eastAsia="Arial" w:hAnsi="Arial" w:cs="Arial"/>
         <w:b/>
         <w:bCs/>
       </w:rPr>
@@ -2048,7 +2037,6 @@
         <w:spacing w:before="0" w:after="0" w:line="240" w:lineRule="auto"/>
       </w:pPr>
       <w:rPr>
-        <w:rFonts w:ascii="Arial" w:eastAsia="Arial" w:hAnsi="Arial" w:cs="Arial"/>
         <w:b/>
         <w:bCs/>
       </w:rPr>
@@ -2069,7 +2057,6 @@
         <w:spacing w:before="0" w:after="0" w:line="240" w:lineRule="auto"/>
       </w:pPr>
       <w:rPr>
-        <w:rFonts w:ascii="Arial" w:eastAsia="Arial" w:hAnsi="Arial" w:cs="Arial"/>
         <w:b/>
         <w:bCs/>
       </w:rPr>
@@ -2087,14 +2074,12 @@
     </w:tblStylePr>
     <w:tblStylePr w:type="firstCol">
       <w:rPr>
-        <w:rFonts w:ascii="Arial" w:eastAsia="Arial" w:hAnsi="Arial" w:cs="Arial"/>
         <w:b/>
         <w:bCs/>
       </w:rPr>
     </w:tblStylePr>
     <w:tblStylePr w:type="lastCol">
       <w:rPr>
-        <w:rFonts w:ascii="Arial" w:eastAsia="Arial" w:hAnsi="Arial" w:cs="Arial"/>
         <w:b/>
         <w:bCs/>
       </w:rPr>
@@ -2148,7 +2133,6 @@
         <w:spacing w:before="0" w:after="0" w:line="240" w:lineRule="auto"/>
       </w:pPr>
       <w:rPr>
-        <w:rFonts w:ascii="Arial" w:eastAsia="Arial" w:hAnsi="Arial" w:cs="Arial"/>
         <w:b/>
         <w:bCs/>
       </w:rPr>
@@ -2169,7 +2153,6 @@
         <w:spacing w:before="0" w:after="0" w:line="240" w:lineRule="auto"/>
       </w:pPr>
       <w:rPr>
-        <w:rFonts w:ascii="Arial" w:eastAsia="Arial" w:hAnsi="Arial" w:cs="Arial"/>
         <w:b/>
         <w:bCs/>
       </w:rPr>
@@ -2187,14 +2170,12 @@
     </w:tblStylePr>
     <w:tblStylePr w:type="firstCol">
       <w:rPr>
-        <w:rFonts w:ascii="Arial" w:eastAsia="Arial" w:hAnsi="Arial" w:cs="Arial"/>
         <w:b/>
         <w:bCs/>
       </w:rPr>
     </w:tblStylePr>
     <w:tblStylePr w:type="lastCol">
       <w:rPr>
-        <w:rFonts w:ascii="Arial" w:eastAsia="Arial" w:hAnsi="Arial" w:cs="Arial"/>
         <w:b/>
         <w:bCs/>
       </w:rPr>
@@ -2248,7 +2229,6 @@
         <w:spacing w:before="0" w:after="0" w:line="240" w:lineRule="auto"/>
       </w:pPr>
       <w:rPr>
-        <w:rFonts w:ascii="Arial" w:eastAsia="Arial" w:hAnsi="Arial" w:cs="Arial"/>
         <w:b/>
         <w:bCs/>
       </w:rPr>
@@ -2269,7 +2249,6 @@
         <w:spacing w:before="0" w:after="0" w:line="240" w:lineRule="auto"/>
       </w:pPr>
       <w:rPr>
-        <w:rFonts w:ascii="Arial" w:eastAsia="Arial" w:hAnsi="Arial" w:cs="Arial"/>
         <w:b/>
         <w:bCs/>
       </w:rPr>
@@ -2287,14 +2266,12 @@
     </w:tblStylePr>
     <w:tblStylePr w:type="firstCol">
       <w:rPr>
-        <w:rFonts w:ascii="Arial" w:eastAsia="Arial" w:hAnsi="Arial" w:cs="Arial"/>
         <w:b/>
         <w:bCs/>
       </w:rPr>
     </w:tblStylePr>
     <w:tblStylePr w:type="lastCol">
       <w:rPr>
-        <w:rFonts w:ascii="Arial" w:eastAsia="Arial" w:hAnsi="Arial" w:cs="Arial"/>
         <w:b/>
         <w:bCs/>
       </w:rPr>
@@ -2348,7 +2325,6 @@
         <w:spacing w:before="0" w:after="0" w:line="240" w:lineRule="auto"/>
       </w:pPr>
       <w:rPr>
-        <w:rFonts w:ascii="Arial" w:eastAsia="Arial" w:hAnsi="Arial" w:cs="Arial"/>
         <w:b/>
         <w:bCs/>
       </w:rPr>
@@ -2369,7 +2345,6 @@
         <w:spacing w:before="0" w:after="0" w:line="240" w:lineRule="auto"/>
       </w:pPr>
       <w:rPr>
-        <w:rFonts w:ascii="Arial" w:eastAsia="Arial" w:hAnsi="Arial" w:cs="Arial"/>
         <w:b/>
         <w:bCs/>
       </w:rPr>
@@ -2387,14 +2362,12 @@
     </w:tblStylePr>
     <w:tblStylePr w:type="firstCol">
       <w:rPr>
-        <w:rFonts w:ascii="Arial" w:eastAsia="Arial" w:hAnsi="Arial" w:cs="Arial"/>
         <w:b/>
         <w:bCs/>
       </w:rPr>
     </w:tblStylePr>
     <w:tblStylePr w:type="lastCol">
       <w:rPr>
-        <w:rFonts w:ascii="Arial" w:eastAsia="Arial" w:hAnsi="Arial" w:cs="Arial"/>
         <w:b/>
         <w:bCs/>
       </w:rPr>
@@ -2448,7 +2421,6 @@
         <w:spacing w:before="0" w:after="0" w:line="240" w:lineRule="auto"/>
       </w:pPr>
       <w:rPr>
-        <w:rFonts w:ascii="Arial" w:eastAsia="Arial" w:hAnsi="Arial" w:cs="Arial"/>
         <w:b/>
         <w:bCs/>
       </w:rPr>
@@ -2469,7 +2441,6 @@
         <w:spacing w:before="0" w:after="0" w:line="240" w:lineRule="auto"/>
       </w:pPr>
       <w:rPr>
-        <w:rFonts w:ascii="Arial" w:eastAsia="Arial" w:hAnsi="Arial" w:cs="Arial"/>
         <w:b/>
         <w:bCs/>
       </w:rPr>
@@ -2487,14 +2458,12 @@
     </w:tblStylePr>
     <w:tblStylePr w:type="firstCol">
       <w:rPr>
-        <w:rFonts w:ascii="Arial" w:eastAsia="Arial" w:hAnsi="Arial" w:cs="Arial"/>
         <w:b/>
         <w:bCs/>
       </w:rPr>
     </w:tblStylePr>
     <w:tblStylePr w:type="lastCol">
       <w:rPr>
-        <w:rFonts w:ascii="Arial" w:eastAsia="Arial" w:hAnsi="Arial" w:cs="Arial"/>
         <w:b/>
         <w:bCs/>
       </w:rPr>
@@ -2548,7 +2517,6 @@
         <w:spacing w:before="0" w:after="0" w:line="240" w:lineRule="auto"/>
       </w:pPr>
       <w:rPr>
-        <w:rFonts w:ascii="Arial" w:eastAsia="Arial" w:hAnsi="Arial" w:cs="Arial"/>
         <w:b/>
         <w:bCs/>
       </w:rPr>
@@ -2569,7 +2537,6 @@
         <w:spacing w:before="0" w:after="0" w:line="240" w:lineRule="auto"/>
       </w:pPr>
       <w:rPr>
-        <w:rFonts w:ascii="Arial" w:eastAsia="Arial" w:hAnsi="Arial" w:cs="Arial"/>
         <w:b/>
         <w:bCs/>
       </w:rPr>
@@ -2587,14 +2554,12 @@
     </w:tblStylePr>
     <w:tblStylePr w:type="firstCol">
       <w:rPr>
-        <w:rFonts w:ascii="Arial" w:eastAsia="Arial" w:hAnsi="Arial" w:cs="Arial"/>
         <w:b/>
         <w:bCs/>
       </w:rPr>
     </w:tblStylePr>
     <w:tblStylePr w:type="lastCol">
       <w:rPr>
-        <w:rFonts w:ascii="Arial" w:eastAsia="Arial" w:hAnsi="Arial" w:cs="Arial"/>
         <w:b/>
         <w:bCs/>
       </w:rPr>
@@ -2647,7 +2612,6 @@
         <w:spacing w:before="0" w:after="0" w:line="240" w:lineRule="auto"/>
       </w:pPr>
       <w:rPr>
-        <w:rFonts w:ascii="Arial" w:eastAsia="Arial" w:hAnsi="Arial" w:cs="Arial"/>
         <w:b/>
         <w:bCs/>
         <w:color w:val="FFFFFF" w:themeColor="background1"/>
@@ -2662,7 +2626,6 @@
         <w:spacing w:before="0" w:after="0" w:line="240" w:lineRule="auto"/>
       </w:pPr>
       <w:rPr>
-        <w:rFonts w:ascii="Arial" w:eastAsia="Arial" w:hAnsi="Arial" w:cs="Arial"/>
         <w:b/>
         <w:bCs/>
       </w:rPr>
@@ -2678,14 +2641,12 @@
     </w:tblStylePr>
     <w:tblStylePr w:type="firstCol">
       <w:rPr>
-        <w:rFonts w:ascii="Arial" w:eastAsia="Arial" w:hAnsi="Arial" w:cs="Arial"/>
         <w:b/>
         <w:bCs/>
       </w:rPr>
     </w:tblStylePr>
     <w:tblStylePr w:type="lastCol">
       <w:rPr>
-        <w:rFonts w:ascii="Arial" w:eastAsia="Arial" w:hAnsi="Arial" w:cs="Arial"/>
         <w:b/>
         <w:bCs/>
       </w:rPr>
@@ -2736,7 +2697,6 @@
         <w:spacing w:before="0" w:after="0" w:line="240" w:lineRule="auto"/>
       </w:pPr>
       <w:rPr>
-        <w:rFonts w:ascii="Arial" w:eastAsia="Arial" w:hAnsi="Arial" w:cs="Arial"/>
         <w:b/>
         <w:bCs/>
         <w:color w:val="FFFFFF" w:themeColor="background1"/>
@@ -2751,7 +2711,6 @@
         <w:spacing w:before="0" w:after="0" w:line="240" w:lineRule="auto"/>
       </w:pPr>
       <w:rPr>
-        <w:rFonts w:ascii="Arial" w:eastAsia="Arial" w:hAnsi="Arial" w:cs="Arial"/>
         <w:b/>
         <w:bCs/>
       </w:rPr>
@@ -2767,14 +2726,12 @@
     </w:tblStylePr>
     <w:tblStylePr w:type="firstCol">
       <w:rPr>
-        <w:rFonts w:ascii="Arial" w:eastAsia="Arial" w:hAnsi="Arial" w:cs="Arial"/>
         <w:b/>
         <w:bCs/>
       </w:rPr>
     </w:tblStylePr>
     <w:tblStylePr w:type="lastCol">
       <w:rPr>
-        <w:rFonts w:ascii="Arial" w:eastAsia="Arial" w:hAnsi="Arial" w:cs="Arial"/>
         <w:b/>
         <w:bCs/>
       </w:rPr>
@@ -2825,7 +2782,6 @@
         <w:spacing w:before="0" w:after="0" w:line="240" w:lineRule="auto"/>
       </w:pPr>
       <w:rPr>
-        <w:rFonts w:ascii="Arial" w:eastAsia="Arial" w:hAnsi="Arial" w:cs="Arial"/>
         <w:b/>
         <w:bCs/>
         <w:color w:val="FFFFFF" w:themeColor="background1"/>
@@ -2840,7 +2796,6 @@
         <w:spacing w:before="0" w:after="0" w:line="240" w:lineRule="auto"/>
       </w:pPr>
       <w:rPr>
-        <w:rFonts w:ascii="Arial" w:eastAsia="Arial" w:hAnsi="Arial" w:cs="Arial"/>
         <w:b/>
         <w:bCs/>
       </w:rPr>
@@ -2856,14 +2811,12 @@
     </w:tblStylePr>
     <w:tblStylePr w:type="firstCol">
       <w:rPr>
-        <w:rFonts w:ascii="Arial" w:eastAsia="Arial" w:hAnsi="Arial" w:cs="Arial"/>
         <w:b/>
         <w:bCs/>
       </w:rPr>
     </w:tblStylePr>
     <w:tblStylePr w:type="lastCol">
       <w:rPr>
-        <w:rFonts w:ascii="Arial" w:eastAsia="Arial" w:hAnsi="Arial" w:cs="Arial"/>
         <w:b/>
         <w:bCs/>
       </w:rPr>
@@ -2914,7 +2867,6 @@
         <w:spacing w:before="0" w:after="0" w:line="240" w:lineRule="auto"/>
       </w:pPr>
       <w:rPr>
-        <w:rFonts w:ascii="Arial" w:eastAsia="Arial" w:hAnsi="Arial" w:cs="Arial"/>
         <w:b/>
         <w:bCs/>
         <w:color w:val="FFFFFF" w:themeColor="background1"/>
@@ -2929,7 +2881,6 @@
         <w:spacing w:before="0" w:after="0" w:line="240" w:lineRule="auto"/>
       </w:pPr>
       <w:rPr>
-        <w:rFonts w:ascii="Arial" w:eastAsia="Arial" w:hAnsi="Arial" w:cs="Arial"/>
         <w:b/>
         <w:bCs/>
       </w:rPr>
@@ -2945,14 +2896,12 @@
     </w:tblStylePr>
     <w:tblStylePr w:type="firstCol">
       <w:rPr>
-        <w:rFonts w:ascii="Arial" w:eastAsia="Arial" w:hAnsi="Arial" w:cs="Arial"/>
         <w:b/>
         <w:bCs/>
       </w:rPr>
     </w:tblStylePr>
     <w:tblStylePr w:type="lastCol">
       <w:rPr>
-        <w:rFonts w:ascii="Arial" w:eastAsia="Arial" w:hAnsi="Arial" w:cs="Arial"/>
         <w:b/>
         <w:bCs/>
       </w:rPr>
@@ -3003,7 +2952,6 @@
         <w:spacing w:before="0" w:after="0" w:line="240" w:lineRule="auto"/>
       </w:pPr>
       <w:rPr>
-        <w:rFonts w:ascii="Arial" w:eastAsia="Arial" w:hAnsi="Arial" w:cs="Arial"/>
         <w:b/>
         <w:bCs/>
         <w:color w:val="FFFFFF" w:themeColor="background1"/>
@@ -3018,7 +2966,6 @@
         <w:spacing w:before="0" w:after="0" w:line="240" w:lineRule="auto"/>
       </w:pPr>
       <w:rPr>
-        <w:rFonts w:ascii="Arial" w:eastAsia="Arial" w:hAnsi="Arial" w:cs="Arial"/>
         <w:b/>
         <w:bCs/>
       </w:rPr>
@@ -3034,14 +2981,12 @@
     </w:tblStylePr>
     <w:tblStylePr w:type="firstCol">
       <w:rPr>
-        <w:rFonts w:ascii="Arial" w:eastAsia="Arial" w:hAnsi="Arial" w:cs="Arial"/>
         <w:b/>
         <w:bCs/>
       </w:rPr>
     </w:tblStylePr>
     <w:tblStylePr w:type="lastCol">
       <w:rPr>
-        <w:rFonts w:ascii="Arial" w:eastAsia="Arial" w:hAnsi="Arial" w:cs="Arial"/>
         <w:b/>
         <w:bCs/>
       </w:rPr>
@@ -3092,7 +3037,6 @@
         <w:spacing w:before="0" w:after="0" w:line="240" w:lineRule="auto"/>
       </w:pPr>
       <w:rPr>
-        <w:rFonts w:ascii="Arial" w:eastAsia="Arial" w:hAnsi="Arial" w:cs="Arial"/>
         <w:b/>
         <w:bCs/>
         <w:color w:val="FFFFFF" w:themeColor="background1"/>
@@ -3107,7 +3051,6 @@
         <w:spacing w:before="0" w:after="0" w:line="240" w:lineRule="auto"/>
       </w:pPr>
       <w:rPr>
-        <w:rFonts w:ascii="Arial" w:eastAsia="Arial" w:hAnsi="Arial" w:cs="Arial"/>
         <w:b/>
         <w:bCs/>
       </w:rPr>
@@ -3123,14 +3066,12 @@
     </w:tblStylePr>
     <w:tblStylePr w:type="firstCol">
       <w:rPr>
-        <w:rFonts w:ascii="Arial" w:eastAsia="Arial" w:hAnsi="Arial" w:cs="Arial"/>
         <w:b/>
         <w:bCs/>
       </w:rPr>
     </w:tblStylePr>
     <w:tblStylePr w:type="lastCol">
       <w:rPr>
-        <w:rFonts w:ascii="Arial" w:eastAsia="Arial" w:hAnsi="Arial" w:cs="Arial"/>
         <w:b/>
         <w:bCs/>
       </w:rPr>
@@ -3181,7 +3122,6 @@
         <w:spacing w:before="0" w:after="0" w:line="240" w:lineRule="auto"/>
       </w:pPr>
       <w:rPr>
-        <w:rFonts w:ascii="Arial" w:eastAsia="Arial" w:hAnsi="Arial" w:cs="Arial"/>
         <w:b/>
         <w:bCs/>
         <w:color w:val="FFFFFF" w:themeColor="background1"/>
@@ -3196,7 +3136,6 @@
         <w:spacing w:before="0" w:after="0" w:line="240" w:lineRule="auto"/>
       </w:pPr>
       <w:rPr>
-        <w:rFonts w:ascii="Arial" w:eastAsia="Arial" w:hAnsi="Arial" w:cs="Arial"/>
         <w:b/>
         <w:bCs/>
       </w:rPr>
@@ -3212,14 +3151,12 @@
     </w:tblStylePr>
     <w:tblStylePr w:type="firstCol">
       <w:rPr>
-        <w:rFonts w:ascii="Arial" w:eastAsia="Arial" w:hAnsi="Arial" w:cs="Arial"/>
         <w:b/>
         <w:bCs/>
       </w:rPr>
     </w:tblStylePr>
     <w:tblStylePr w:type="lastCol">
       <w:rPr>
-        <w:rFonts w:ascii="Arial" w:eastAsia="Arial" w:hAnsi="Arial" w:cs="Arial"/>
         <w:b/>
         <w:bCs/>
       </w:rPr>
@@ -3272,7 +3209,7 @@
         <w:spacing w:before="0" w:after="0" w:line="240" w:lineRule="auto"/>
       </w:pPr>
       <w:rPr>
-        <w:rFonts w:ascii="Arial" w:eastAsia="Arial" w:hAnsi="Arial" w:cs="Arial"/>
+        <w:rFonts w:asciiTheme="majorHAnsi" w:eastAsiaTheme="majorEastAsia" w:hAnsiTheme="majorHAnsi" w:cstheme="majorBidi"/>
         <w:b/>
         <w:bCs/>
       </w:rPr>
@@ -3293,7 +3230,7 @@
         <w:spacing w:before="0" w:after="0" w:line="240" w:lineRule="auto"/>
       </w:pPr>
       <w:rPr>
-        <w:rFonts w:ascii="Arial" w:eastAsia="Arial" w:hAnsi="Arial" w:cs="Arial"/>
+        <w:rFonts w:asciiTheme="majorHAnsi" w:eastAsiaTheme="majorEastAsia" w:hAnsiTheme="majorHAnsi" w:cstheme="majorBidi"/>
         <w:b/>
         <w:bCs/>
       </w:rPr>
@@ -3311,14 +3248,14 @@
     </w:tblStylePr>
     <w:tblStylePr w:type="firstCol">
       <w:rPr>
-        <w:rFonts w:ascii="Arial" w:eastAsia="Arial" w:hAnsi="Arial" w:cs="Arial"/>
+        <w:rFonts w:asciiTheme="majorHAnsi" w:eastAsiaTheme="majorEastAsia" w:hAnsiTheme="majorHAnsi" w:cstheme="majorBidi"/>
         <w:b/>
         <w:bCs/>
       </w:rPr>
     </w:tblStylePr>
     <w:tblStylePr w:type="lastCol">
       <w:rPr>
-        <w:rFonts w:ascii="Arial" w:eastAsia="Arial" w:hAnsi="Arial" w:cs="Arial"/>
+        <w:rFonts w:asciiTheme="majorHAnsi" w:eastAsiaTheme="majorEastAsia" w:hAnsiTheme="majorHAnsi" w:cstheme="majorBidi"/>
         <w:b/>
         <w:bCs/>
       </w:rPr>
@@ -3395,7 +3332,7 @@
         <w:spacing w:before="0" w:after="0" w:line="240" w:lineRule="auto"/>
       </w:pPr>
       <w:rPr>
-        <w:rFonts w:ascii="Arial" w:eastAsia="Arial" w:hAnsi="Arial" w:cs="Arial"/>
+        <w:rFonts w:asciiTheme="majorHAnsi" w:eastAsiaTheme="majorEastAsia" w:hAnsiTheme="majorHAnsi" w:cstheme="majorBidi"/>
         <w:b/>
         <w:bCs/>
       </w:rPr>
@@ -3416,7 +3353,7 @@
         <w:spacing w:before="0" w:after="0" w:line="240" w:lineRule="auto"/>
       </w:pPr>
       <w:rPr>
-        <w:rFonts w:ascii="Arial" w:eastAsia="Arial" w:hAnsi="Arial" w:cs="Arial"/>
+        <w:rFonts w:asciiTheme="majorHAnsi" w:eastAsiaTheme="majorEastAsia" w:hAnsiTheme="majorHAnsi" w:cstheme="majorBidi"/>
         <w:b/>
         <w:bCs/>
       </w:rPr>
@@ -3434,14 +3371,14 @@
     </w:tblStylePr>
     <w:tblStylePr w:type="firstCol">
       <w:rPr>
-        <w:rFonts w:ascii="Arial" w:eastAsia="Arial" w:hAnsi="Arial" w:cs="Arial"/>
+        <w:rFonts w:asciiTheme="majorHAnsi" w:eastAsiaTheme="majorEastAsia" w:hAnsiTheme="majorHAnsi" w:cstheme="majorBidi"/>
         <w:b/>
         <w:bCs/>
       </w:rPr>
     </w:tblStylePr>
     <w:tblStylePr w:type="lastCol">
       <w:rPr>
-        <w:rFonts w:ascii="Arial" w:eastAsia="Arial" w:hAnsi="Arial" w:cs="Arial"/>
+        <w:rFonts w:asciiTheme="majorHAnsi" w:eastAsiaTheme="majorEastAsia" w:hAnsiTheme="majorHAnsi" w:cstheme="majorBidi"/>
         <w:b/>
         <w:bCs/>
       </w:rPr>
@@ -3518,7 +3455,7 @@
         <w:spacing w:before="0" w:after="0" w:line="240" w:lineRule="auto"/>
       </w:pPr>
       <w:rPr>
-        <w:rFonts w:ascii="Arial" w:eastAsia="Arial" w:hAnsi="Arial" w:cs="Arial"/>
+        <w:rFonts w:asciiTheme="majorHAnsi" w:eastAsiaTheme="majorEastAsia" w:hAnsiTheme="majorHAnsi" w:cstheme="majorBidi"/>
         <w:b/>
         <w:bCs/>
       </w:rPr>
@@ -3539,7 +3476,7 @@
         <w:spacing w:before="0" w:after="0" w:line="240" w:lineRule="auto"/>
       </w:pPr>
       <w:rPr>
-        <w:rFonts w:ascii="Arial" w:eastAsia="Arial" w:hAnsi="Arial" w:cs="Arial"/>
+        <w:rFonts w:asciiTheme="majorHAnsi" w:eastAsiaTheme="majorEastAsia" w:hAnsiTheme="majorHAnsi" w:cstheme="majorBidi"/>
         <w:b/>
         <w:bCs/>
       </w:rPr>
@@ -3557,14 +3494,14 @@
     </w:tblStylePr>
     <w:tblStylePr w:type="firstCol">
       <w:rPr>
-        <w:rFonts w:ascii="Arial" w:eastAsia="Arial" w:hAnsi="Arial" w:cs="Arial"/>
+        <w:rFonts w:asciiTheme="majorHAnsi" w:eastAsiaTheme="majorEastAsia" w:hAnsiTheme="majorHAnsi" w:cstheme="majorBidi"/>
         <w:b/>
         <w:bCs/>
       </w:rPr>
     </w:tblStylePr>
     <w:tblStylePr w:type="lastCol">
       <w:rPr>
-        <w:rFonts w:ascii="Arial" w:eastAsia="Arial" w:hAnsi="Arial" w:cs="Arial"/>
+        <w:rFonts w:asciiTheme="majorHAnsi" w:eastAsiaTheme="majorEastAsia" w:hAnsiTheme="majorHAnsi" w:cstheme="majorBidi"/>
         <w:b/>
         <w:bCs/>
       </w:rPr>
@@ -3641,7 +3578,7 @@
         <w:spacing w:before="0" w:after="0" w:line="240" w:lineRule="auto"/>
       </w:pPr>
       <w:rPr>
-        <w:rFonts w:ascii="Arial" w:eastAsia="Arial" w:hAnsi="Arial" w:cs="Arial"/>
+        <w:rFonts w:asciiTheme="majorHAnsi" w:eastAsiaTheme="majorEastAsia" w:hAnsiTheme="majorHAnsi" w:cstheme="majorBidi"/>
         <w:b/>
         <w:bCs/>
       </w:rPr>
@@ -3662,7 +3599,7 @@
         <w:spacing w:before="0" w:after="0" w:line="240" w:lineRule="auto"/>
       </w:pPr>
       <w:rPr>
-        <w:rFonts w:ascii="Arial" w:eastAsia="Arial" w:hAnsi="Arial" w:cs="Arial"/>
+        <w:rFonts w:asciiTheme="majorHAnsi" w:eastAsiaTheme="majorEastAsia" w:hAnsiTheme="majorHAnsi" w:cstheme="majorBidi"/>
         <w:b/>
         <w:bCs/>
       </w:rPr>
@@ -3680,14 +3617,14 @@
     </w:tblStylePr>
     <w:tblStylePr w:type="firstCol">
       <w:rPr>
-        <w:rFonts w:ascii="Arial" w:eastAsia="Arial" w:hAnsi="Arial" w:cs="Arial"/>
+        <w:rFonts w:asciiTheme="majorHAnsi" w:eastAsiaTheme="majorEastAsia" w:hAnsiTheme="majorHAnsi" w:cstheme="majorBidi"/>
         <w:b/>
         <w:bCs/>
       </w:rPr>
     </w:tblStylePr>
     <w:tblStylePr w:type="lastCol">
       <w:rPr>
-        <w:rFonts w:ascii="Arial" w:eastAsia="Arial" w:hAnsi="Arial" w:cs="Arial"/>
+        <w:rFonts w:asciiTheme="majorHAnsi" w:eastAsiaTheme="majorEastAsia" w:hAnsiTheme="majorHAnsi" w:cstheme="majorBidi"/>
         <w:b/>
         <w:bCs/>
       </w:rPr>
@@ -3764,7 +3701,7 @@
         <w:spacing w:before="0" w:after="0" w:line="240" w:lineRule="auto"/>
       </w:pPr>
       <w:rPr>
-        <w:rFonts w:ascii="Arial" w:eastAsia="Arial" w:hAnsi="Arial" w:cs="Arial"/>
+        <w:rFonts w:asciiTheme="majorHAnsi" w:eastAsiaTheme="majorEastAsia" w:hAnsiTheme="majorHAnsi" w:cstheme="majorBidi"/>
         <w:b/>
         <w:bCs/>
       </w:rPr>
@@ -3785,7 +3722,7 @@
         <w:spacing w:before="0" w:after="0" w:line="240" w:lineRule="auto"/>
       </w:pPr>
       <w:rPr>
-        <w:rFonts w:ascii="Arial" w:eastAsia="Arial" w:hAnsi="Arial" w:cs="Arial"/>
+        <w:rFonts w:asciiTheme="majorHAnsi" w:eastAsiaTheme="majorEastAsia" w:hAnsiTheme="majorHAnsi" w:cstheme="majorBidi"/>
         <w:b/>
         <w:bCs/>
       </w:rPr>
@@ -3803,14 +3740,14 @@
     </w:tblStylePr>
     <w:tblStylePr w:type="firstCol">
       <w:rPr>
-        <w:rFonts w:ascii="Arial" w:eastAsia="Arial" w:hAnsi="Arial" w:cs="Arial"/>
+        <w:rFonts w:asciiTheme="majorHAnsi" w:eastAsiaTheme="majorEastAsia" w:hAnsiTheme="majorHAnsi" w:cstheme="majorBidi"/>
         <w:b/>
         <w:bCs/>
       </w:rPr>
     </w:tblStylePr>
     <w:tblStylePr w:type="lastCol">
       <w:rPr>
-        <w:rFonts w:ascii="Arial" w:eastAsia="Arial" w:hAnsi="Arial" w:cs="Arial"/>
+        <w:rFonts w:asciiTheme="majorHAnsi" w:eastAsiaTheme="majorEastAsia" w:hAnsiTheme="majorHAnsi" w:cstheme="majorBidi"/>
         <w:b/>
         <w:bCs/>
       </w:rPr>
@@ -3887,7 +3824,7 @@
         <w:spacing w:before="0" w:after="0" w:line="240" w:lineRule="auto"/>
       </w:pPr>
       <w:rPr>
-        <w:rFonts w:ascii="Arial" w:eastAsia="Arial" w:hAnsi="Arial" w:cs="Arial"/>
+        <w:rFonts w:asciiTheme="majorHAnsi" w:eastAsiaTheme="majorEastAsia" w:hAnsiTheme="majorHAnsi" w:cstheme="majorBidi"/>
         <w:b/>
         <w:bCs/>
       </w:rPr>
@@ -3908,7 +3845,7 @@
         <w:spacing w:before="0" w:after="0" w:line="240" w:lineRule="auto"/>
       </w:pPr>
       <w:rPr>
-        <w:rFonts w:ascii="Arial" w:eastAsia="Arial" w:hAnsi="Arial" w:cs="Arial"/>
+        <w:rFonts w:asciiTheme="majorHAnsi" w:eastAsiaTheme="majorEastAsia" w:hAnsiTheme="majorHAnsi" w:cstheme="majorBidi"/>
         <w:b/>
         <w:bCs/>
       </w:rPr>
@@ -3926,14 +3863,14 @@
     </w:tblStylePr>
     <w:tblStylePr w:type="firstCol">
       <w:rPr>
-        <w:rFonts w:ascii="Arial" w:eastAsia="Arial" w:hAnsi="Arial" w:cs="Arial"/>
+        <w:rFonts w:asciiTheme="majorHAnsi" w:eastAsiaTheme="majorEastAsia" w:hAnsiTheme="majorHAnsi" w:cstheme="majorBidi"/>
         <w:b/>
         <w:bCs/>
       </w:rPr>
     </w:tblStylePr>
     <w:tblStylePr w:type="lastCol">
       <w:rPr>
-        <w:rFonts w:ascii="Arial" w:eastAsia="Arial" w:hAnsi="Arial" w:cs="Arial"/>
+        <w:rFonts w:asciiTheme="majorHAnsi" w:eastAsiaTheme="majorEastAsia" w:hAnsiTheme="majorHAnsi" w:cstheme="majorBidi"/>
         <w:b/>
         <w:bCs/>
       </w:rPr>
@@ -4010,7 +3947,7 @@
         <w:spacing w:before="0" w:after="0" w:line="240" w:lineRule="auto"/>
       </w:pPr>
       <w:rPr>
-        <w:rFonts w:ascii="Arial" w:eastAsia="Arial" w:hAnsi="Arial" w:cs="Arial"/>
+        <w:rFonts w:asciiTheme="majorHAnsi" w:eastAsiaTheme="majorEastAsia" w:hAnsiTheme="majorHAnsi" w:cstheme="majorBidi"/>
         <w:b/>
         <w:bCs/>
       </w:rPr>
@@ -4031,7 +3968,7 @@
         <w:spacing w:before="0" w:after="0" w:line="240" w:lineRule="auto"/>
       </w:pPr>
       <w:rPr>
-        <w:rFonts w:ascii="Arial" w:eastAsia="Arial" w:hAnsi="Arial" w:cs="Arial"/>
+        <w:rFonts w:asciiTheme="majorHAnsi" w:eastAsiaTheme="majorEastAsia" w:hAnsiTheme="majorHAnsi" w:cstheme="majorBidi"/>
         <w:b/>
         <w:bCs/>
       </w:rPr>
@@ -4049,14 +3986,14 @@
     </w:tblStylePr>
     <w:tblStylePr w:type="firstCol">
       <w:rPr>
-        <w:rFonts w:ascii="Arial" w:eastAsia="Arial" w:hAnsi="Arial" w:cs="Arial"/>
+        <w:rFonts w:asciiTheme="majorHAnsi" w:eastAsiaTheme="majorEastAsia" w:hAnsiTheme="majorHAnsi" w:cstheme="majorBidi"/>
         <w:b/>
         <w:bCs/>
       </w:rPr>
     </w:tblStylePr>
     <w:tblStylePr w:type="lastCol">
       <w:rPr>
-        <w:rFonts w:ascii="Arial" w:eastAsia="Arial" w:hAnsi="Arial" w:cs="Arial"/>
+        <w:rFonts w:asciiTheme="majorHAnsi" w:eastAsiaTheme="majorEastAsia" w:hAnsiTheme="majorHAnsi" w:cstheme="majorBidi"/>
         <w:b/>
         <w:bCs/>
       </w:rPr>
@@ -4132,7 +4069,6 @@
         <w:spacing w:before="0" w:after="0" w:line="240" w:lineRule="auto"/>
       </w:pPr>
       <w:rPr>
-        <w:rFonts w:ascii="Arial" w:eastAsia="Arial" w:hAnsi="Arial" w:cs="Arial"/>
         <w:b/>
         <w:bCs/>
         <w:color w:val="FFFFFF" w:themeColor="background1"/>
@@ -4155,7 +4091,6 @@
         <w:spacing w:before="0" w:after="0" w:line="240" w:lineRule="auto"/>
       </w:pPr>
       <w:rPr>
-        <w:rFonts w:ascii="Arial" w:eastAsia="Arial" w:hAnsi="Arial" w:cs="Arial"/>
         <w:b/>
         <w:bCs/>
       </w:rPr>
@@ -4173,14 +4108,12 @@
     </w:tblStylePr>
     <w:tblStylePr w:type="firstCol">
       <w:rPr>
-        <w:rFonts w:ascii="Arial" w:eastAsia="Arial" w:hAnsi="Arial" w:cs="Arial"/>
         <w:b/>
         <w:bCs/>
       </w:rPr>
     </w:tblStylePr>
     <w:tblStylePr w:type="lastCol">
       <w:rPr>
-        <w:rFonts w:ascii="Arial" w:eastAsia="Arial" w:hAnsi="Arial" w:cs="Arial"/>
         <w:b/>
         <w:bCs/>
       </w:rPr>
@@ -4235,7 +4168,6 @@
         <w:spacing w:before="0" w:after="0" w:line="240" w:lineRule="auto"/>
       </w:pPr>
       <w:rPr>
-        <w:rFonts w:ascii="Arial" w:eastAsia="Arial" w:hAnsi="Arial" w:cs="Arial"/>
         <w:b/>
         <w:bCs/>
         <w:color w:val="FFFFFF" w:themeColor="background1"/>
@@ -4258,7 +4190,6 @@
         <w:spacing w:before="0" w:after="0" w:line="240" w:lineRule="auto"/>
       </w:pPr>
       <w:rPr>
-        <w:rFonts w:ascii="Arial" w:eastAsia="Arial" w:hAnsi="Arial" w:cs="Arial"/>
         <w:b/>
         <w:bCs/>
       </w:rPr>
@@ -4276,14 +4207,12 @@
     </w:tblStylePr>
     <w:tblStylePr w:type="firstCol">
       <w:rPr>
-        <w:rFonts w:ascii="Arial" w:eastAsia="Arial" w:hAnsi="Arial" w:cs="Arial"/>
         <w:b/>
         <w:bCs/>
       </w:rPr>
     </w:tblStylePr>
     <w:tblStylePr w:type="lastCol">
       <w:rPr>
-        <w:rFonts w:ascii="Arial" w:eastAsia="Arial" w:hAnsi="Arial" w:cs="Arial"/>
         <w:b/>
         <w:bCs/>
       </w:rPr>
@@ -4338,7 +4267,6 @@
         <w:spacing w:before="0" w:after="0" w:line="240" w:lineRule="auto"/>
       </w:pPr>
       <w:rPr>
-        <w:rFonts w:ascii="Arial" w:eastAsia="Arial" w:hAnsi="Arial" w:cs="Arial"/>
         <w:b/>
         <w:bCs/>
         <w:color w:val="FFFFFF" w:themeColor="background1"/>
@@ -4361,7 +4289,6 @@
         <w:spacing w:before="0" w:after="0" w:line="240" w:lineRule="auto"/>
       </w:pPr>
       <w:rPr>
-        <w:rFonts w:ascii="Arial" w:eastAsia="Arial" w:hAnsi="Arial" w:cs="Arial"/>
         <w:b/>
         <w:bCs/>
       </w:rPr>
@@ -4379,14 +4306,12 @@
     </w:tblStylePr>
     <w:tblStylePr w:type="firstCol">
       <w:rPr>
-        <w:rFonts w:ascii="Arial" w:eastAsia="Arial" w:hAnsi="Arial" w:cs="Arial"/>
         <w:b/>
         <w:bCs/>
       </w:rPr>
     </w:tblStylePr>
     <w:tblStylePr w:type="lastCol">
       <w:rPr>
-        <w:rFonts w:ascii="Arial" w:eastAsia="Arial" w:hAnsi="Arial" w:cs="Arial"/>
         <w:b/>
         <w:bCs/>
       </w:rPr>
@@ -4441,7 +4366,6 @@
         <w:spacing w:before="0" w:after="0" w:line="240" w:lineRule="auto"/>
       </w:pPr>
       <w:rPr>
-        <w:rFonts w:ascii="Arial" w:eastAsia="Arial" w:hAnsi="Arial" w:cs="Arial"/>
         <w:b/>
         <w:bCs/>
         <w:color w:val="FFFFFF" w:themeColor="background1"/>
@@ -4464,7 +4388,6 @@
         <w:spacing w:before="0" w:after="0" w:line="240" w:lineRule="auto"/>
       </w:pPr>
       <w:rPr>
-        <w:rFonts w:ascii="Arial" w:eastAsia="Arial" w:hAnsi="Arial" w:cs="Arial"/>
         <w:b/>
         <w:bCs/>
       </w:rPr>
@@ -4482,14 +4405,12 @@
     </w:tblStylePr>
     <w:tblStylePr w:type="firstCol">
       <w:rPr>
-        <w:rFonts w:ascii="Arial" w:eastAsia="Arial" w:hAnsi="Arial" w:cs="Arial"/>
         <w:b/>
         <w:bCs/>
       </w:rPr>
     </w:tblStylePr>
     <w:tblStylePr w:type="lastCol">
       <w:rPr>
-        <w:rFonts w:ascii="Arial" w:eastAsia="Arial" w:hAnsi="Arial" w:cs="Arial"/>
         <w:b/>
         <w:bCs/>
       </w:rPr>
@@ -4544,7 +4465,6 @@
         <w:spacing w:before="0" w:after="0" w:line="240" w:lineRule="auto"/>
       </w:pPr>
       <w:rPr>
-        <w:rFonts w:ascii="Arial" w:eastAsia="Arial" w:hAnsi="Arial" w:cs="Arial"/>
         <w:b/>
         <w:bCs/>
         <w:color w:val="FFFFFF" w:themeColor="background1"/>
@@ -4567,7 +4487,6 @@
         <w:spacing w:before="0" w:after="0" w:line="240" w:lineRule="auto"/>
       </w:pPr>
       <w:rPr>
-        <w:rFonts w:ascii="Arial" w:eastAsia="Arial" w:hAnsi="Arial" w:cs="Arial"/>
         <w:b/>
         <w:bCs/>
       </w:rPr>
@@ -4585,14 +4504,12 @@
     </w:tblStylePr>
     <w:tblStylePr w:type="firstCol">
       <w:rPr>
-        <w:rFonts w:ascii="Arial" w:eastAsia="Arial" w:hAnsi="Arial" w:cs="Arial"/>
         <w:b/>
         <w:bCs/>
       </w:rPr>
     </w:tblStylePr>
     <w:tblStylePr w:type="lastCol">
       <w:rPr>
-        <w:rFonts w:ascii="Arial" w:eastAsia="Arial" w:hAnsi="Arial" w:cs="Arial"/>
         <w:b/>
         <w:bCs/>
       </w:rPr>
@@ -4647,7 +4564,6 @@
         <w:spacing w:before="0" w:after="0" w:line="240" w:lineRule="auto"/>
       </w:pPr>
       <w:rPr>
-        <w:rFonts w:ascii="Arial" w:eastAsia="Arial" w:hAnsi="Arial" w:cs="Arial"/>
         <w:b/>
         <w:bCs/>
         <w:color w:val="FFFFFF" w:themeColor="background1"/>
@@ -4670,7 +4586,6 @@
         <w:spacing w:before="0" w:after="0" w:line="240" w:lineRule="auto"/>
       </w:pPr>
       <w:rPr>
-        <w:rFonts w:ascii="Arial" w:eastAsia="Arial" w:hAnsi="Arial" w:cs="Arial"/>
         <w:b/>
         <w:bCs/>
       </w:rPr>
@@ -4688,14 +4603,12 @@
     </w:tblStylePr>
     <w:tblStylePr w:type="firstCol">
       <w:rPr>
-        <w:rFonts w:ascii="Arial" w:eastAsia="Arial" w:hAnsi="Arial" w:cs="Arial"/>
         <w:b/>
         <w:bCs/>
       </w:rPr>
     </w:tblStylePr>
     <w:tblStylePr w:type="lastCol">
       <w:rPr>
-        <w:rFonts w:ascii="Arial" w:eastAsia="Arial" w:hAnsi="Arial" w:cs="Arial"/>
         <w:b/>
         <w:bCs/>
       </w:rPr>
@@ -4750,7 +4663,6 @@
         <w:spacing w:before="0" w:after="0" w:line="240" w:lineRule="auto"/>
       </w:pPr>
       <w:rPr>
-        <w:rFonts w:ascii="Arial" w:eastAsia="Arial" w:hAnsi="Arial" w:cs="Arial"/>
         <w:b/>
         <w:bCs/>
         <w:color w:val="FFFFFF" w:themeColor="background1"/>
@@ -4773,7 +4685,6 @@
         <w:spacing w:before="0" w:after="0" w:line="240" w:lineRule="auto"/>
       </w:pPr>
       <w:rPr>
-        <w:rFonts w:ascii="Arial" w:eastAsia="Arial" w:hAnsi="Arial" w:cs="Arial"/>
         <w:b/>
         <w:bCs/>
       </w:rPr>
@@ -4791,14 +4702,12 @@
     </w:tblStylePr>
     <w:tblStylePr w:type="firstCol">
       <w:rPr>
-        <w:rFonts w:ascii="Arial" w:eastAsia="Arial" w:hAnsi="Arial" w:cs="Arial"/>
         <w:b/>
         <w:bCs/>
       </w:rPr>
     </w:tblStylePr>
     <w:tblStylePr w:type="lastCol">
       <w:rPr>
-        <w:rFonts w:ascii="Arial" w:eastAsia="Arial" w:hAnsi="Arial" w:cs="Arial"/>
         <w:b/>
         <w:bCs/>
       </w:rPr>
@@ -4850,7 +4759,6 @@
         <w:spacing w:before="0" w:after="0" w:line="240" w:lineRule="auto"/>
       </w:pPr>
       <w:rPr>
-        <w:rFonts w:ascii="Arial" w:eastAsia="Arial" w:hAnsi="Arial" w:cs="Arial"/>
         <w:b/>
         <w:bCs/>
         <w:color w:val="FFFFFF" w:themeColor="background1"/>
@@ -4873,7 +4781,6 @@
         <w:spacing w:before="0" w:after="0" w:line="240" w:lineRule="auto"/>
       </w:pPr>
       <w:rPr>
-        <w:rFonts w:ascii="Arial" w:eastAsia="Arial" w:hAnsi="Arial" w:cs="Arial"/>
         <w:color w:val="auto"/>
       </w:rPr>
       <w:tblPr/>
@@ -4891,7 +4798,6 @@
     </w:tblStylePr>
     <w:tblStylePr w:type="firstCol">
       <w:rPr>
-        <w:rFonts w:ascii="Arial" w:eastAsia="Arial" w:hAnsi="Arial" w:cs="Arial"/>
         <w:b/>
         <w:bCs/>
         <w:color w:val="FFFFFF" w:themeColor="background1"/>
@@ -4911,7 +4817,6 @@
     </w:tblStylePr>
     <w:tblStylePr w:type="lastCol">
       <w:rPr>
-        <w:rFonts w:ascii="Arial" w:eastAsia="Arial" w:hAnsi="Arial" w:cs="Arial"/>
         <w:b/>
         <w:bCs/>
         <w:color w:val="FFFFFF" w:themeColor="background1"/>
@@ -4960,7 +4865,6 @@
     </w:tblStylePr>
     <w:tblStylePr w:type="nwCell">
       <w:rPr>
-        <w:rFonts w:ascii="Arial" w:eastAsia="Arial" w:hAnsi="Arial" w:cs="Arial"/>
         <w:color w:val="FFFFFF" w:themeColor="background1"/>
       </w:rPr>
       <w:tblPr/>
@@ -4997,7 +4901,6 @@
         <w:spacing w:before="0" w:after="0" w:line="240" w:lineRule="auto"/>
       </w:pPr>
       <w:rPr>
-        <w:rFonts w:ascii="Arial" w:eastAsia="Arial" w:hAnsi="Arial" w:cs="Arial"/>
         <w:b/>
         <w:bCs/>
         <w:color w:val="FFFFFF" w:themeColor="background1"/>
@@ -5020,7 +4923,6 @@
         <w:spacing w:before="0" w:after="0" w:line="240" w:lineRule="auto"/>
       </w:pPr>
       <w:rPr>
-        <w:rFonts w:ascii="Arial" w:eastAsia="Arial" w:hAnsi="Arial" w:cs="Arial"/>
         <w:color w:val="auto"/>
       </w:rPr>
       <w:tblPr/>
@@ -5038,7 +4940,6 @@
     </w:tblStylePr>
     <w:tblStylePr w:type="firstCol">
       <w:rPr>
-        <w:rFonts w:ascii="Arial" w:eastAsia="Arial" w:hAnsi="Arial" w:cs="Arial"/>
         <w:b/>
         <w:bCs/>
         <w:color w:val="FFFFFF" w:themeColor="background1"/>
@@ -5058,7 +4959,6 @@
     </w:tblStylePr>
     <w:tblStylePr w:type="lastCol">
       <w:rPr>
-        <w:rFonts w:ascii="Arial" w:eastAsia="Arial" w:hAnsi="Arial" w:cs="Arial"/>
         <w:b/>
         <w:bCs/>
         <w:color w:val="FFFFFF" w:themeColor="background1"/>
@@ -5107,7 +5007,6 @@
     </w:tblStylePr>
     <w:tblStylePr w:type="nwCell">
       <w:rPr>
-        <w:rFonts w:ascii="Arial" w:eastAsia="Arial" w:hAnsi="Arial" w:cs="Arial"/>
         <w:color w:val="FFFFFF" w:themeColor="background1"/>
       </w:rPr>
       <w:tblPr/>
@@ -5144,7 +5043,6 @@
         <w:spacing w:before="0" w:after="0" w:line="240" w:lineRule="auto"/>
       </w:pPr>
       <w:rPr>
-        <w:rFonts w:ascii="Arial" w:eastAsia="Arial" w:hAnsi="Arial" w:cs="Arial"/>
         <w:b/>
         <w:bCs/>
         <w:color w:val="FFFFFF" w:themeColor="background1"/>
@@ -5167,7 +5065,6 @@
         <w:spacing w:before="0" w:after="0" w:line="240" w:lineRule="auto"/>
       </w:pPr>
       <w:rPr>
-        <w:rFonts w:ascii="Arial" w:eastAsia="Arial" w:hAnsi="Arial" w:cs="Arial"/>
         <w:color w:val="auto"/>
       </w:rPr>
       <w:tblPr/>
@@ -5185,7 +5082,6 @@
     </w:tblStylePr>
     <w:tblStylePr w:type="firstCol">
       <w:rPr>
-        <w:rFonts w:ascii="Arial" w:eastAsia="Arial" w:hAnsi="Arial" w:cs="Arial"/>
         <w:b/>
         <w:bCs/>
         <w:color w:val="FFFFFF" w:themeColor="background1"/>
@@ -5205,7 +5101,6 @@
     </w:tblStylePr>
     <w:tblStylePr w:type="lastCol">
       <w:rPr>
-        <w:rFonts w:ascii="Arial" w:eastAsia="Arial" w:hAnsi="Arial" w:cs="Arial"/>
         <w:b/>
         <w:bCs/>
         <w:color w:val="FFFFFF" w:themeColor="background1"/>
@@ -5254,7 +5149,6 @@
     </w:tblStylePr>
     <w:tblStylePr w:type="nwCell">
       <w:rPr>
-        <w:rFonts w:ascii="Arial" w:eastAsia="Arial" w:hAnsi="Arial" w:cs="Arial"/>
         <w:color w:val="FFFFFF" w:themeColor="background1"/>
       </w:rPr>
       <w:tblPr/>
@@ -5291,7 +5185,6 @@
         <w:spacing w:before="0" w:after="0" w:line="240" w:lineRule="auto"/>
       </w:pPr>
       <w:rPr>
-        <w:rFonts w:ascii="Arial" w:eastAsia="Arial" w:hAnsi="Arial" w:cs="Arial"/>
         <w:b/>
         <w:bCs/>
         <w:color w:val="FFFFFF" w:themeColor="background1"/>
@@ -5314,7 +5207,6 @@
         <w:spacing w:before="0" w:after="0" w:line="240" w:lineRule="auto"/>
       </w:pPr>
       <w:rPr>
-        <w:rFonts w:ascii="Arial" w:eastAsia="Arial" w:hAnsi="Arial" w:cs="Arial"/>
         <w:color w:val="auto"/>
       </w:rPr>
       <w:tblPr/>
@@ -5332,7 +5224,6 @@
     </w:tblStylePr>
     <w:tblStylePr w:type="firstCol">
       <w:rPr>
-        <w:rFonts w:ascii="Arial" w:eastAsia="Arial" w:hAnsi="Arial" w:cs="Arial"/>
         <w:b/>
         <w:bCs/>
         <w:color w:val="FFFFFF" w:themeColor="background1"/>
@@ -5352,7 +5243,6 @@
     </w:tblStylePr>
     <w:tblStylePr w:type="lastCol">
       <w:rPr>
-        <w:rFonts w:ascii="Arial" w:eastAsia="Arial" w:hAnsi="Arial" w:cs="Arial"/>
         <w:b/>
         <w:bCs/>
         <w:color w:val="FFFFFF" w:themeColor="background1"/>
@@ -5401,7 +5291,6 @@
     </w:tblStylePr>
     <w:tblStylePr w:type="nwCell">
       <w:rPr>
-        <w:rFonts w:ascii="Arial" w:eastAsia="Arial" w:hAnsi="Arial" w:cs="Arial"/>
         <w:color w:val="FFFFFF" w:themeColor="background1"/>
       </w:rPr>
       <w:tblPr/>
@@ -5438,7 +5327,6 @@
         <w:spacing w:before="0" w:after="0" w:line="240" w:lineRule="auto"/>
       </w:pPr>
       <w:rPr>
-        <w:rFonts w:ascii="Arial" w:eastAsia="Arial" w:hAnsi="Arial" w:cs="Arial"/>
         <w:b/>
         <w:bCs/>
         <w:color w:val="FFFFFF" w:themeColor="background1"/>
@@ -5461,7 +5349,6 @@
         <w:spacing w:before="0" w:after="0" w:line="240" w:lineRule="auto"/>
       </w:pPr>
       <w:rPr>
-        <w:rFonts w:ascii="Arial" w:eastAsia="Arial" w:hAnsi="Arial" w:cs="Arial"/>
         <w:color w:val="auto"/>
       </w:rPr>
       <w:tblPr/>
@@ -5479,7 +5366,6 @@
     </w:tblStylePr>
     <w:tblStylePr w:type="firstCol">
       <w:rPr>
-        <w:rFonts w:ascii="Arial" w:eastAsia="Arial" w:hAnsi="Arial" w:cs="Arial"/>
         <w:b/>
         <w:bCs/>
         <w:color w:val="FFFFFF" w:themeColor="background1"/>
@@ -5499,7 +5385,6 @@
     </w:tblStylePr>
     <w:tblStylePr w:type="lastCol">
       <w:rPr>
-        <w:rFonts w:ascii="Arial" w:eastAsia="Arial" w:hAnsi="Arial" w:cs="Arial"/>
         <w:b/>
         <w:bCs/>
         <w:color w:val="FFFFFF" w:themeColor="background1"/>
@@ -5548,7 +5433,6 @@
     </w:tblStylePr>
     <w:tblStylePr w:type="nwCell">
       <w:rPr>
-        <w:rFonts w:ascii="Arial" w:eastAsia="Arial" w:hAnsi="Arial" w:cs="Arial"/>
         <w:color w:val="FFFFFF" w:themeColor="background1"/>
       </w:rPr>
       <w:tblPr/>
@@ -5585,7 +5469,6 @@
         <w:spacing w:before="0" w:after="0" w:line="240" w:lineRule="auto"/>
       </w:pPr>
       <w:rPr>
-        <w:rFonts w:ascii="Arial" w:eastAsia="Arial" w:hAnsi="Arial" w:cs="Arial"/>
         <w:b/>
         <w:bCs/>
         <w:color w:val="FFFFFF" w:themeColor="background1"/>
@@ -5608,7 +5491,6 @@
         <w:spacing w:before="0" w:after="0" w:line="240" w:lineRule="auto"/>
       </w:pPr>
       <w:rPr>
-        <w:rFonts w:ascii="Arial" w:eastAsia="Arial" w:hAnsi="Arial" w:cs="Arial"/>
         <w:color w:val="auto"/>
       </w:rPr>
       <w:tblPr/>
@@ -5626,7 +5508,6 @@
     </w:tblStylePr>
     <w:tblStylePr w:type="firstCol">
       <w:rPr>
-        <w:rFonts w:ascii="Arial" w:eastAsia="Arial" w:hAnsi="Arial" w:cs="Arial"/>
         <w:b/>
         <w:bCs/>
         <w:color w:val="FFFFFF" w:themeColor="background1"/>
@@ -5646,7 +5527,6 @@
     </w:tblStylePr>
     <w:tblStylePr w:type="lastCol">
       <w:rPr>
-        <w:rFonts w:ascii="Arial" w:eastAsia="Arial" w:hAnsi="Arial" w:cs="Arial"/>
         <w:b/>
         <w:bCs/>
         <w:color w:val="FFFFFF" w:themeColor="background1"/>
@@ -5695,7 +5575,6 @@
     </w:tblStylePr>
     <w:tblStylePr w:type="nwCell">
       <w:rPr>
-        <w:rFonts w:ascii="Arial" w:eastAsia="Arial" w:hAnsi="Arial" w:cs="Arial"/>
         <w:color w:val="FFFFFF" w:themeColor="background1"/>
       </w:rPr>
       <w:tblPr/>
@@ -5732,7 +5611,6 @@
         <w:spacing w:before="0" w:after="0" w:line="240" w:lineRule="auto"/>
       </w:pPr>
       <w:rPr>
-        <w:rFonts w:ascii="Arial" w:eastAsia="Arial" w:hAnsi="Arial" w:cs="Arial"/>
         <w:b/>
         <w:bCs/>
         <w:color w:val="FFFFFF" w:themeColor="background1"/>
@@ -5755,7 +5633,6 @@
         <w:spacing w:before="0" w:after="0" w:line="240" w:lineRule="auto"/>
       </w:pPr>
       <w:rPr>
-        <w:rFonts w:ascii="Arial" w:eastAsia="Arial" w:hAnsi="Arial" w:cs="Arial"/>
         <w:color w:val="auto"/>
       </w:rPr>
       <w:tblPr/>
@@ -5773,7 +5650,6 @@
     </w:tblStylePr>
     <w:tblStylePr w:type="firstCol">
       <w:rPr>
-        <w:rFonts w:ascii="Arial" w:eastAsia="Arial" w:hAnsi="Arial" w:cs="Arial"/>
         <w:b/>
         <w:bCs/>
         <w:color w:val="FFFFFF" w:themeColor="background1"/>
@@ -5793,7 +5669,6 @@
     </w:tblStylePr>
     <w:tblStylePr w:type="lastCol">
       <w:rPr>
-        <w:rFonts w:ascii="Arial" w:eastAsia="Arial" w:hAnsi="Arial" w:cs="Arial"/>
         <w:b/>
         <w:bCs/>
         <w:color w:val="FFFFFF" w:themeColor="background1"/>
@@ -5842,7 +5717,6 @@
     </w:tblStylePr>
     <w:tblStylePr w:type="nwCell">
       <w:rPr>
-        <w:rFonts w:ascii="Arial" w:eastAsia="Arial" w:hAnsi="Arial" w:cs="Arial"/>
         <w:color w:val="FFFFFF" w:themeColor="background1"/>
       </w:rPr>
       <w:tblPr/>
@@ -5879,7 +5753,7 @@
     </w:tblPr>
     <w:tblStylePr w:type="firstRow">
       <w:rPr>
-        <w:rFonts w:ascii="Arial" w:eastAsia="Arial" w:hAnsi="Arial" w:cs="Arial"/>
+        <w:rFonts w:asciiTheme="majorHAnsi" w:eastAsiaTheme="majorEastAsia" w:hAnsiTheme="majorHAnsi" w:cstheme="majorBidi"/>
       </w:rPr>
       <w:tblPr/>
       <w:tcPr>
@@ -5891,7 +5765,6 @@
     </w:tblStylePr>
     <w:tblStylePr w:type="lastRow">
       <w:rPr>
-        <w:rFonts w:ascii="Arial" w:eastAsia="Arial" w:hAnsi="Arial" w:cs="Arial"/>
         <w:b/>
         <w:bCs/>
         <w:color w:val="1F497D" w:themeColor="text2"/>
@@ -5906,14 +5779,12 @@
     </w:tblStylePr>
     <w:tblStylePr w:type="firstCol">
       <w:rPr>
-        <w:rFonts w:ascii="Arial" w:eastAsia="Arial" w:hAnsi="Arial" w:cs="Arial"/>
         <w:b/>
         <w:bCs/>
       </w:rPr>
     </w:tblStylePr>
     <w:tblStylePr w:type="lastCol">
       <w:rPr>
-        <w:rFonts w:ascii="Arial" w:eastAsia="Arial" w:hAnsi="Arial" w:cs="Arial"/>
         <w:b/>
         <w:bCs/>
       </w:rPr>
@@ -5959,7 +5830,7 @@
     </w:tblPr>
     <w:tblStylePr w:type="firstRow">
       <w:rPr>
-        <w:rFonts w:ascii="Arial" w:eastAsia="Arial" w:hAnsi="Arial" w:cs="Arial"/>
+        <w:rFonts w:asciiTheme="majorHAnsi" w:eastAsiaTheme="majorEastAsia" w:hAnsiTheme="majorHAnsi" w:cstheme="majorBidi"/>
       </w:rPr>
       <w:tblPr/>
       <w:tcPr>
@@ -5971,7 +5842,6 @@
     </w:tblStylePr>
     <w:tblStylePr w:type="lastRow">
       <w:rPr>
-        <w:rFonts w:ascii="Arial" w:eastAsia="Arial" w:hAnsi="Arial" w:cs="Arial"/>
         <w:b/>
         <w:bCs/>
         <w:color w:val="1F497D" w:themeColor="text2"/>
@@ -5986,14 +5856,12 @@
     </w:tblStylePr>
     <w:tblStylePr w:type="firstCol">
       <w:rPr>
-        <w:rFonts w:ascii="Arial" w:eastAsia="Arial" w:hAnsi="Arial" w:cs="Arial"/>
         <w:b/>
         <w:bCs/>
       </w:rPr>
     </w:tblStylePr>
     <w:tblStylePr w:type="lastCol">
       <w:rPr>
-        <w:rFonts w:ascii="Arial" w:eastAsia="Arial" w:hAnsi="Arial" w:cs="Arial"/>
         <w:b/>
         <w:bCs/>
       </w:rPr>
@@ -6039,7 +5907,7 @@
     </w:tblPr>
     <w:tblStylePr w:type="firstRow">
       <w:rPr>
-        <w:rFonts w:ascii="Arial" w:eastAsia="Arial" w:hAnsi="Arial" w:cs="Arial"/>
+        <w:rFonts w:asciiTheme="majorHAnsi" w:eastAsiaTheme="majorEastAsia" w:hAnsiTheme="majorHAnsi" w:cstheme="majorBidi"/>
       </w:rPr>
       <w:tblPr/>
       <w:tcPr>
@@ -6051,7 +5919,6 @@
     </w:tblStylePr>
     <w:tblStylePr w:type="lastRow">
       <w:rPr>
-        <w:rFonts w:ascii="Arial" w:eastAsia="Arial" w:hAnsi="Arial" w:cs="Arial"/>
         <w:b/>
         <w:bCs/>
         <w:color w:val="1F497D" w:themeColor="text2"/>
@@ -6066,14 +5933,12 @@
     </w:tblStylePr>
     <w:tblStylePr w:type="firstCol">
       <w:rPr>
-        <w:rFonts w:ascii="Arial" w:eastAsia="Arial" w:hAnsi="Arial" w:cs="Arial"/>
         <w:b/>
         <w:bCs/>
       </w:rPr>
     </w:tblStylePr>
     <w:tblStylePr w:type="lastCol">
       <w:rPr>
-        <w:rFonts w:ascii="Arial" w:eastAsia="Arial" w:hAnsi="Arial" w:cs="Arial"/>
         <w:b/>
         <w:bCs/>
       </w:rPr>
@@ -6119,7 +5984,7 @@
     </w:tblPr>
     <w:tblStylePr w:type="firstRow">
       <w:rPr>
-        <w:rFonts w:ascii="Arial" w:eastAsia="Arial" w:hAnsi="Arial" w:cs="Arial"/>
+        <w:rFonts w:asciiTheme="majorHAnsi" w:eastAsiaTheme="majorEastAsia" w:hAnsiTheme="majorHAnsi" w:cstheme="majorBidi"/>
       </w:rPr>
       <w:tblPr/>
       <w:tcPr>
@@ -6131,7 +5996,6 @@
     </w:tblStylePr>
     <w:tblStylePr w:type="lastRow">
       <w:rPr>
-        <w:rFonts w:ascii="Arial" w:eastAsia="Arial" w:hAnsi="Arial" w:cs="Arial"/>
         <w:b/>
         <w:bCs/>
         <w:color w:val="1F497D" w:themeColor="text2"/>
@@ -6146,14 +6010,12 @@
     </w:tblStylePr>
     <w:tblStylePr w:type="firstCol">
       <w:rPr>
-        <w:rFonts w:ascii="Arial" w:eastAsia="Arial" w:hAnsi="Arial" w:cs="Arial"/>
         <w:b/>
         <w:bCs/>
       </w:rPr>
     </w:tblStylePr>
     <w:tblStylePr w:type="lastCol">
       <w:rPr>
-        <w:rFonts w:ascii="Arial" w:eastAsia="Arial" w:hAnsi="Arial" w:cs="Arial"/>
         <w:b/>
         <w:bCs/>
       </w:rPr>
@@ -6199,7 +6061,7 @@
     </w:tblPr>
     <w:tblStylePr w:type="firstRow">
       <w:rPr>
-        <w:rFonts w:ascii="Arial" w:eastAsia="Arial" w:hAnsi="Arial" w:cs="Arial"/>
+        <w:rFonts w:asciiTheme="majorHAnsi" w:eastAsiaTheme="majorEastAsia" w:hAnsiTheme="majorHAnsi" w:cstheme="majorBidi"/>
       </w:rPr>
       <w:tblPr/>
       <w:tcPr>
@@ -6211,7 +6073,6 @@
     </w:tblStylePr>
     <w:tblStylePr w:type="lastRow">
       <w:rPr>
-        <w:rFonts w:ascii="Arial" w:eastAsia="Arial" w:hAnsi="Arial" w:cs="Arial"/>
         <w:b/>
         <w:bCs/>
         <w:color w:val="1F497D" w:themeColor="text2"/>
@@ -6226,14 +6087,12 @@
     </w:tblStylePr>
     <w:tblStylePr w:type="firstCol">
       <w:rPr>
-        <w:rFonts w:ascii="Arial" w:eastAsia="Arial" w:hAnsi="Arial" w:cs="Arial"/>
         <w:b/>
         <w:bCs/>
       </w:rPr>
     </w:tblStylePr>
     <w:tblStylePr w:type="lastCol">
       <w:rPr>
-        <w:rFonts w:ascii="Arial" w:eastAsia="Arial" w:hAnsi="Arial" w:cs="Arial"/>
         <w:b/>
         <w:bCs/>
       </w:rPr>
@@ -6279,7 +6138,7 @@
     </w:tblPr>
     <w:tblStylePr w:type="firstRow">
       <w:rPr>
-        <w:rFonts w:ascii="Arial" w:eastAsia="Arial" w:hAnsi="Arial" w:cs="Arial"/>
+        <w:rFonts w:asciiTheme="majorHAnsi" w:eastAsiaTheme="majorEastAsia" w:hAnsiTheme="majorHAnsi" w:cstheme="majorBidi"/>
       </w:rPr>
       <w:tblPr/>
       <w:tcPr>
@@ -6291,7 +6150,6 @@
     </w:tblStylePr>
     <w:tblStylePr w:type="lastRow">
       <w:rPr>
-        <w:rFonts w:ascii="Arial" w:eastAsia="Arial" w:hAnsi="Arial" w:cs="Arial"/>
         <w:b/>
         <w:bCs/>
         <w:color w:val="1F497D" w:themeColor="text2"/>
@@ -6306,14 +6164,12 @@
     </w:tblStylePr>
     <w:tblStylePr w:type="firstCol">
       <w:rPr>
-        <w:rFonts w:ascii="Arial" w:eastAsia="Arial" w:hAnsi="Arial" w:cs="Arial"/>
         <w:b/>
         <w:bCs/>
       </w:rPr>
     </w:tblStylePr>
     <w:tblStylePr w:type="lastCol">
       <w:rPr>
-        <w:rFonts w:ascii="Arial" w:eastAsia="Arial" w:hAnsi="Arial" w:cs="Arial"/>
         <w:b/>
         <w:bCs/>
       </w:rPr>
@@ -6359,7 +6215,7 @@
     </w:tblPr>
     <w:tblStylePr w:type="firstRow">
       <w:rPr>
-        <w:rFonts w:ascii="Arial" w:eastAsia="Arial" w:hAnsi="Arial" w:cs="Arial"/>
+        <w:rFonts w:asciiTheme="majorHAnsi" w:eastAsiaTheme="majorEastAsia" w:hAnsiTheme="majorHAnsi" w:cstheme="majorBidi"/>
       </w:rPr>
       <w:tblPr/>
       <w:tcPr>
@@ -6371,7 +6227,6 @@
     </w:tblStylePr>
     <w:tblStylePr w:type="lastRow">
       <w:rPr>
-        <w:rFonts w:ascii="Arial" w:eastAsia="Arial" w:hAnsi="Arial" w:cs="Arial"/>
         <w:b/>
         <w:bCs/>
         <w:color w:val="1F497D" w:themeColor="text2"/>
@@ -6386,14 +6241,12 @@
     </w:tblStylePr>
     <w:tblStylePr w:type="firstCol">
       <w:rPr>
-        <w:rFonts w:ascii="Arial" w:eastAsia="Arial" w:hAnsi="Arial" w:cs="Arial"/>
         <w:b/>
         <w:bCs/>
       </w:rPr>
     </w:tblStylePr>
     <w:tblStylePr w:type="lastCol">
       <w:rPr>
-        <w:rFonts w:ascii="Arial" w:eastAsia="Arial" w:hAnsi="Arial" w:cs="Arial"/>
         <w:b/>
         <w:bCs/>
       </w:rPr>
@@ -6427,6 +6280,7 @@
       <w:spacing w:after="0" w:line="240" w:lineRule="auto"/>
     </w:pPr>
     <w:rPr>
+      <w:rFonts w:asciiTheme="majorHAnsi" w:eastAsiaTheme="majorEastAsia" w:hAnsiTheme="majorHAnsi" w:cstheme="majorBidi"/>
       <w:color w:val="000000" w:themeColor="text1"/>
     </w:rPr>
     <w:tblPr>
@@ -6441,7 +6295,6 @@
     </w:tblPr>
     <w:tblStylePr w:type="firstRow">
       <w:rPr>
-        <w:rFonts w:ascii="Arial" w:eastAsia="Arial" w:hAnsi="Arial" w:cs="Arial"/>
         <w:sz w:val="24"/>
         <w:szCs w:val="24"/>
       </w:rPr>
@@ -6548,6 +6401,7 @@
       <w:spacing w:after="0" w:line="240" w:lineRule="auto"/>
     </w:pPr>
     <w:rPr>
+      <w:rFonts w:asciiTheme="majorHAnsi" w:eastAsiaTheme="majorEastAsia" w:hAnsiTheme="majorHAnsi" w:cstheme="majorBidi"/>
       <w:color w:val="000000" w:themeColor="text1"/>
     </w:rPr>
     <w:tblPr>
@@ -6562,7 +6416,6 @@
     </w:tblPr>
     <w:tblStylePr w:type="firstRow">
       <w:rPr>
-        <w:rFonts w:ascii="Arial" w:eastAsia="Arial" w:hAnsi="Arial" w:cs="Arial"/>
         <w:sz w:val="24"/>
         <w:szCs w:val="24"/>
       </w:rPr>
@@ -6669,6 +6522,7 @@
       <w:spacing w:after="0" w:line="240" w:lineRule="auto"/>
     </w:pPr>
     <w:rPr>
+      <w:rFonts w:asciiTheme="majorHAnsi" w:eastAsiaTheme="majorEastAsia" w:hAnsiTheme="majorHAnsi" w:cstheme="majorBidi"/>
       <w:color w:val="000000" w:themeColor="text1"/>
     </w:rPr>
     <w:tblPr>
@@ -6683,7 +6537,6 @@
     </w:tblPr>
     <w:tblStylePr w:type="firstRow">
       <w:rPr>
-        <w:rFonts w:ascii="Arial" w:eastAsia="Arial" w:hAnsi="Arial" w:cs="Arial"/>
         <w:sz w:val="24"/>
         <w:szCs w:val="24"/>
       </w:rPr>
@@ -6790,6 +6643,7 @@
       <w:spacing w:after="0" w:line="240" w:lineRule="auto"/>
     </w:pPr>
     <w:rPr>
+      <w:rFonts w:asciiTheme="majorHAnsi" w:eastAsiaTheme="majorEastAsia" w:hAnsiTheme="majorHAnsi" w:cstheme="majorBidi"/>
       <w:color w:val="000000" w:themeColor="text1"/>
     </w:rPr>
     <w:tblPr>
@@ -6804,7 +6658,6 @@
     </w:tblPr>
     <w:tblStylePr w:type="firstRow">
       <w:rPr>
-        <w:rFonts w:ascii="Arial" w:eastAsia="Arial" w:hAnsi="Arial" w:cs="Arial"/>
         <w:sz w:val="24"/>
         <w:szCs w:val="24"/>
       </w:rPr>
@@ -6911,6 +6764,7 @@
       <w:spacing w:after="0" w:line="240" w:lineRule="auto"/>
     </w:pPr>
     <w:rPr>
+      <w:rFonts w:asciiTheme="majorHAnsi" w:eastAsiaTheme="majorEastAsia" w:hAnsiTheme="majorHAnsi" w:cstheme="majorBidi"/>
       <w:color w:val="000000" w:themeColor="text1"/>
     </w:rPr>
     <w:tblPr>
@@ -6925,7 +6779,6 @@
     </w:tblPr>
     <w:tblStylePr w:type="firstRow">
       <w:rPr>
-        <w:rFonts w:ascii="Arial" w:eastAsia="Arial" w:hAnsi="Arial" w:cs="Arial"/>
         <w:sz w:val="24"/>
         <w:szCs w:val="24"/>
       </w:rPr>
@@ -7032,6 +6885,7 @@
       <w:spacing w:after="0" w:line="240" w:lineRule="auto"/>
     </w:pPr>
     <w:rPr>
+      <w:rFonts w:asciiTheme="majorHAnsi" w:eastAsiaTheme="majorEastAsia" w:hAnsiTheme="majorHAnsi" w:cstheme="majorBidi"/>
       <w:color w:val="000000" w:themeColor="text1"/>
     </w:rPr>
     <w:tblPr>
@@ -7046,7 +6900,6 @@
     </w:tblPr>
     <w:tblStylePr w:type="firstRow">
       <w:rPr>
-        <w:rFonts w:ascii="Arial" w:eastAsia="Arial" w:hAnsi="Arial" w:cs="Arial"/>
         <w:sz w:val="24"/>
         <w:szCs w:val="24"/>
       </w:rPr>
@@ -7153,6 +7006,7 @@
       <w:spacing w:after="0" w:line="240" w:lineRule="auto"/>
     </w:pPr>
     <w:rPr>
+      <w:rFonts w:asciiTheme="majorHAnsi" w:eastAsiaTheme="majorEastAsia" w:hAnsiTheme="majorHAnsi" w:cstheme="majorBidi"/>
       <w:color w:val="000000" w:themeColor="text1"/>
     </w:rPr>
     <w:tblPr>
@@ -7167,7 +7021,6 @@
     </w:tblPr>
     <w:tblStylePr w:type="firstRow">
       <w:rPr>
-        <w:rFonts w:ascii="Arial" w:eastAsia="Arial" w:hAnsi="Arial" w:cs="Arial"/>
         <w:sz w:val="24"/>
         <w:szCs w:val="24"/>
       </w:rPr>
@@ -7290,14 +7143,12 @@
     </w:tcPr>
     <w:tblStylePr w:type="firstRow">
       <w:rPr>
-        <w:rFonts w:ascii="Arial" w:eastAsia="Arial" w:hAnsi="Arial" w:cs="Arial"/>
         <w:b/>
         <w:bCs/>
       </w:rPr>
     </w:tblStylePr>
     <w:tblStylePr w:type="lastRow">
       <w:rPr>
-        <w:rFonts w:ascii="Arial" w:eastAsia="Arial" w:hAnsi="Arial" w:cs="Arial"/>
         <w:b/>
         <w:bCs/>
       </w:rPr>
@@ -7310,14 +7161,12 @@
     </w:tblStylePr>
     <w:tblStylePr w:type="firstCol">
       <w:rPr>
-        <w:rFonts w:ascii="Arial" w:eastAsia="Arial" w:hAnsi="Arial" w:cs="Arial"/>
         <w:b/>
         <w:bCs/>
       </w:rPr>
     </w:tblStylePr>
     <w:tblStylePr w:type="lastCol">
       <w:rPr>
-        <w:rFonts w:ascii="Arial" w:eastAsia="Arial" w:hAnsi="Arial" w:cs="Arial"/>
         <w:b/>
         <w:bCs/>
       </w:rPr>
@@ -7360,14 +7209,12 @@
     </w:tcPr>
     <w:tblStylePr w:type="firstRow">
       <w:rPr>
-        <w:rFonts w:ascii="Arial" w:eastAsia="Arial" w:hAnsi="Arial" w:cs="Arial"/>
         <w:b/>
         <w:bCs/>
       </w:rPr>
     </w:tblStylePr>
     <w:tblStylePr w:type="lastRow">
       <w:rPr>
-        <w:rFonts w:ascii="Arial" w:eastAsia="Arial" w:hAnsi="Arial" w:cs="Arial"/>
         <w:b/>
         <w:bCs/>
       </w:rPr>
@@ -7380,14 +7227,12 @@
     </w:tblStylePr>
     <w:tblStylePr w:type="firstCol">
       <w:rPr>
-        <w:rFonts w:ascii="Arial" w:eastAsia="Arial" w:hAnsi="Arial" w:cs="Arial"/>
         <w:b/>
         <w:bCs/>
       </w:rPr>
     </w:tblStylePr>
     <w:tblStylePr w:type="lastCol">
       <w:rPr>
-        <w:rFonts w:ascii="Arial" w:eastAsia="Arial" w:hAnsi="Arial" w:cs="Arial"/>
         <w:b/>
         <w:bCs/>
       </w:rPr>
@@ -7430,14 +7275,12 @@
     </w:tcPr>
     <w:tblStylePr w:type="firstRow">
       <w:rPr>
-        <w:rFonts w:ascii="Arial" w:eastAsia="Arial" w:hAnsi="Arial" w:cs="Arial"/>
         <w:b/>
         <w:bCs/>
       </w:rPr>
     </w:tblStylePr>
     <w:tblStylePr w:type="lastRow">
       <w:rPr>
-        <w:rFonts w:ascii="Arial" w:eastAsia="Arial" w:hAnsi="Arial" w:cs="Arial"/>
         <w:b/>
         <w:bCs/>
       </w:rPr>
@@ -7450,14 +7293,12 @@
     </w:tblStylePr>
     <w:tblStylePr w:type="firstCol">
       <w:rPr>
-        <w:rFonts w:ascii="Arial" w:eastAsia="Arial" w:hAnsi="Arial" w:cs="Arial"/>
         <w:b/>
         <w:bCs/>
       </w:rPr>
     </w:tblStylePr>
     <w:tblStylePr w:type="lastCol">
       <w:rPr>
-        <w:rFonts w:ascii="Arial" w:eastAsia="Arial" w:hAnsi="Arial" w:cs="Arial"/>
         <w:b/>
         <w:bCs/>
       </w:rPr>
@@ -7500,14 +7341,12 @@
     </w:tcPr>
     <w:tblStylePr w:type="firstRow">
       <w:rPr>
-        <w:rFonts w:ascii="Arial" w:eastAsia="Arial" w:hAnsi="Arial" w:cs="Arial"/>
         <w:b/>
         <w:bCs/>
       </w:rPr>
     </w:tblStylePr>
     <w:tblStylePr w:type="lastRow">
       <w:rPr>
-        <w:rFonts w:ascii="Arial" w:eastAsia="Arial" w:hAnsi="Arial" w:cs="Arial"/>
         <w:b/>
         <w:bCs/>
       </w:rPr>
@@ -7520,14 +7359,12 @@
     </w:tblStylePr>
     <w:tblStylePr w:type="firstCol">
       <w:rPr>
-        <w:rFonts w:ascii="Arial" w:eastAsia="Arial" w:hAnsi="Arial" w:cs="Arial"/>
         <w:b/>
         <w:bCs/>
       </w:rPr>
     </w:tblStylePr>
     <w:tblStylePr w:type="lastCol">
       <w:rPr>
-        <w:rFonts w:ascii="Arial" w:eastAsia="Arial" w:hAnsi="Arial" w:cs="Arial"/>
         <w:b/>
         <w:bCs/>
       </w:rPr>
@@ -7570,14 +7407,12 @@
     </w:tcPr>
     <w:tblStylePr w:type="firstRow">
       <w:rPr>
-        <w:rFonts w:ascii="Arial" w:eastAsia="Arial" w:hAnsi="Arial" w:cs="Arial"/>
         <w:b/>
         <w:bCs/>
       </w:rPr>
     </w:tblStylePr>
     <w:tblStylePr w:type="lastRow">
       <w:rPr>
-        <w:rFonts w:ascii="Arial" w:eastAsia="Arial" w:hAnsi="Arial" w:cs="Arial"/>
         <w:b/>
         <w:bCs/>
       </w:rPr>
@@ -7590,14 +7425,12 @@
     </w:tblStylePr>
     <w:tblStylePr w:type="firstCol">
       <w:rPr>
-        <w:rFonts w:ascii="Arial" w:eastAsia="Arial" w:hAnsi="Arial" w:cs="Arial"/>
         <w:b/>
         <w:bCs/>
       </w:rPr>
     </w:tblStylePr>
     <w:tblStylePr w:type="lastCol">
       <w:rPr>
-        <w:rFonts w:ascii="Arial" w:eastAsia="Arial" w:hAnsi="Arial" w:cs="Arial"/>
         <w:b/>
         <w:bCs/>
       </w:rPr>
@@ -7640,14 +7473,12 @@
     </w:tcPr>
     <w:tblStylePr w:type="firstRow">
       <w:rPr>
-        <w:rFonts w:ascii="Arial" w:eastAsia="Arial" w:hAnsi="Arial" w:cs="Arial"/>
         <w:b/>
         <w:bCs/>
       </w:rPr>
     </w:tblStylePr>
     <w:tblStylePr w:type="lastRow">
       <w:rPr>
-        <w:rFonts w:ascii="Arial" w:eastAsia="Arial" w:hAnsi="Arial" w:cs="Arial"/>
         <w:b/>
         <w:bCs/>
       </w:rPr>
@@ -7660,14 +7491,12 @@
     </w:tblStylePr>
     <w:tblStylePr w:type="firstCol">
       <w:rPr>
-        <w:rFonts w:ascii="Arial" w:eastAsia="Arial" w:hAnsi="Arial" w:cs="Arial"/>
         <w:b/>
         <w:bCs/>
       </w:rPr>
     </w:tblStylePr>
     <w:tblStylePr w:type="lastCol">
       <w:rPr>
-        <w:rFonts w:ascii="Arial" w:eastAsia="Arial" w:hAnsi="Arial" w:cs="Arial"/>
         <w:b/>
         <w:bCs/>
       </w:rPr>
@@ -7710,14 +7539,12 @@
     </w:tcPr>
     <w:tblStylePr w:type="firstRow">
       <w:rPr>
-        <w:rFonts w:ascii="Arial" w:eastAsia="Arial" w:hAnsi="Arial" w:cs="Arial"/>
         <w:b/>
         <w:bCs/>
       </w:rPr>
     </w:tblStylePr>
     <w:tblStylePr w:type="lastRow">
       <w:rPr>
-        <w:rFonts w:ascii="Arial" w:eastAsia="Arial" w:hAnsi="Arial" w:cs="Arial"/>
         <w:b/>
         <w:bCs/>
       </w:rPr>
@@ -7730,14 +7557,12 @@
     </w:tblStylePr>
     <w:tblStylePr w:type="firstCol">
       <w:rPr>
-        <w:rFonts w:ascii="Arial" w:eastAsia="Arial" w:hAnsi="Arial" w:cs="Arial"/>
         <w:b/>
         <w:bCs/>
       </w:rPr>
     </w:tblStylePr>
     <w:tblStylePr w:type="lastCol">
       <w:rPr>
-        <w:rFonts w:ascii="Arial" w:eastAsia="Arial" w:hAnsi="Arial" w:cs="Arial"/>
         <w:b/>
         <w:bCs/>
       </w:rPr>
@@ -7764,6 +7589,7 @@
       <w:spacing w:after="0" w:line="240" w:lineRule="auto"/>
     </w:pPr>
     <w:rPr>
+      <w:rFonts w:asciiTheme="majorHAnsi" w:eastAsiaTheme="majorEastAsia" w:hAnsiTheme="majorHAnsi" w:cstheme="majorBidi"/>
       <w:color w:val="000000" w:themeColor="text1"/>
     </w:rPr>
     <w:tblPr>
@@ -7783,7 +7609,6 @@
     </w:tcPr>
     <w:tblStylePr w:type="firstRow">
       <w:rPr>
-        <w:rFonts w:ascii="Arial" w:eastAsia="Arial" w:hAnsi="Arial" w:cs="Arial"/>
         <w:b/>
         <w:bCs/>
         <w:color w:val="000000" w:themeColor="text1"/>
@@ -7795,7 +7620,6 @@
     </w:tblStylePr>
     <w:tblStylePr w:type="lastRow">
       <w:rPr>
-        <w:rFonts w:ascii="Arial" w:eastAsia="Arial" w:hAnsi="Arial" w:cs="Arial"/>
         <w:b/>
         <w:bCs/>
         <w:color w:val="000000" w:themeColor="text1"/>
@@ -7815,7 +7639,6 @@
     </w:tblStylePr>
     <w:tblStylePr w:type="firstCol">
       <w:rPr>
-        <w:rFonts w:ascii="Arial" w:eastAsia="Arial" w:hAnsi="Arial" w:cs="Arial"/>
         <w:b/>
         <w:bCs/>
         <w:color w:val="000000" w:themeColor="text1"/>
@@ -7835,7 +7658,6 @@
     </w:tblStylePr>
     <w:tblStylePr w:type="lastCol">
       <w:rPr>
-        <w:rFonts w:ascii="Arial" w:eastAsia="Arial" w:hAnsi="Arial" w:cs="Arial"/>
         <w:b w:val="0"/>
         <w:bCs w:val="0"/>
         <w:color w:val="000000" w:themeColor="text1"/>
@@ -7885,6 +7707,7 @@
       <w:spacing w:after="0" w:line="240" w:lineRule="auto"/>
     </w:pPr>
     <w:rPr>
+      <w:rFonts w:asciiTheme="majorHAnsi" w:eastAsiaTheme="majorEastAsia" w:hAnsiTheme="majorHAnsi" w:cstheme="majorBidi"/>
       <w:color w:val="000000" w:themeColor="text1"/>
     </w:rPr>
     <w:tblPr>
@@ -7904,7 +7727,6 @@
     </w:tcPr>
     <w:tblStylePr w:type="firstRow">
       <w:rPr>
-        <w:rFonts w:ascii="Arial" w:eastAsia="Arial" w:hAnsi="Arial" w:cs="Arial"/>
         <w:b/>
         <w:bCs/>
         <w:color w:val="000000" w:themeColor="text1"/>
@@ -7916,7 +7738,6 @@
     </w:tblStylePr>
     <w:tblStylePr w:type="lastRow">
       <w:rPr>
-        <w:rFonts w:ascii="Arial" w:eastAsia="Arial" w:hAnsi="Arial" w:cs="Arial"/>
         <w:b/>
         <w:bCs/>
         <w:color w:val="000000" w:themeColor="text1"/>
@@ -7936,7 +7757,6 @@
     </w:tblStylePr>
     <w:tblStylePr w:type="firstCol">
       <w:rPr>
-        <w:rFonts w:ascii="Arial" w:eastAsia="Arial" w:hAnsi="Arial" w:cs="Arial"/>
         <w:b/>
         <w:bCs/>
         <w:color w:val="000000" w:themeColor="text1"/>
@@ -7956,7 +7776,6 @@
     </w:tblStylePr>
     <w:tblStylePr w:type="lastCol">
       <w:rPr>
-        <w:rFonts w:ascii="Arial" w:eastAsia="Arial" w:hAnsi="Arial" w:cs="Arial"/>
         <w:b w:val="0"/>
         <w:bCs w:val="0"/>
         <w:color w:val="000000" w:themeColor="text1"/>
@@ -8006,6 +7825,7 @@
       <w:spacing w:after="0" w:line="240" w:lineRule="auto"/>
     </w:pPr>
     <w:rPr>
+      <w:rFonts w:asciiTheme="majorHAnsi" w:eastAsiaTheme="majorEastAsia" w:hAnsiTheme="majorHAnsi" w:cstheme="majorBidi"/>
       <w:color w:val="000000" w:themeColor="text1"/>
     </w:rPr>
     <w:tblPr>
@@ -8025,7 +7845,6 @@
     </w:tcPr>
     <w:tblStylePr w:type="firstRow">
       <w:rPr>
-        <w:rFonts w:ascii="Arial" w:eastAsia="Arial" w:hAnsi="Arial" w:cs="Arial"/>
         <w:b/>
         <w:bCs/>
         <w:color w:val="000000" w:themeColor="text1"/>
@@ -8037,7 +7856,6 @@
     </w:tblStylePr>
     <w:tblStylePr w:type="lastRow">
       <w:rPr>
-        <w:rFonts w:ascii="Arial" w:eastAsia="Arial" w:hAnsi="Arial" w:cs="Arial"/>
         <w:b/>
         <w:bCs/>
         <w:color w:val="000000" w:themeColor="text1"/>
@@ -8057,7 +7875,6 @@
     </w:tblStylePr>
     <w:tblStylePr w:type="firstCol">
       <w:rPr>
-        <w:rFonts w:ascii="Arial" w:eastAsia="Arial" w:hAnsi="Arial" w:cs="Arial"/>
         <w:b/>
         <w:bCs/>
         <w:color w:val="000000" w:themeColor="text1"/>
@@ -8077,7 +7894,6 @@
     </w:tblStylePr>
     <w:tblStylePr w:type="lastCol">
       <w:rPr>
-        <w:rFonts w:ascii="Arial" w:eastAsia="Arial" w:hAnsi="Arial" w:cs="Arial"/>
         <w:b w:val="0"/>
         <w:bCs w:val="0"/>
         <w:color w:val="000000" w:themeColor="text1"/>
@@ -8127,6 +7943,7 @@
       <w:spacing w:after="0" w:line="240" w:lineRule="auto"/>
     </w:pPr>
     <w:rPr>
+      <w:rFonts w:asciiTheme="majorHAnsi" w:eastAsiaTheme="majorEastAsia" w:hAnsiTheme="majorHAnsi" w:cstheme="majorBidi"/>
       <w:color w:val="000000" w:themeColor="text1"/>
     </w:rPr>
     <w:tblPr>
@@ -8146,7 +7963,6 @@
     </w:tcPr>
     <w:tblStylePr w:type="firstRow">
       <w:rPr>
-        <w:rFonts w:ascii="Arial" w:eastAsia="Arial" w:hAnsi="Arial" w:cs="Arial"/>
         <w:b/>
         <w:bCs/>
         <w:color w:val="000000" w:themeColor="text1"/>
@@ -8158,7 +7974,6 @@
     </w:tblStylePr>
     <w:tblStylePr w:type="lastRow">
       <w:rPr>
-        <w:rFonts w:ascii="Arial" w:eastAsia="Arial" w:hAnsi="Arial" w:cs="Arial"/>
         <w:b/>
         <w:bCs/>
         <w:color w:val="000000" w:themeColor="text1"/>
@@ -8178,7 +7993,6 @@
     </w:tblStylePr>
     <w:tblStylePr w:type="firstCol">
       <w:rPr>
-        <w:rFonts w:ascii="Arial" w:eastAsia="Arial" w:hAnsi="Arial" w:cs="Arial"/>
         <w:b/>
         <w:bCs/>
         <w:color w:val="000000" w:themeColor="text1"/>
@@ -8198,7 +8012,6 @@
     </w:tblStylePr>
     <w:tblStylePr w:type="lastCol">
       <w:rPr>
-        <w:rFonts w:ascii="Arial" w:eastAsia="Arial" w:hAnsi="Arial" w:cs="Arial"/>
         <w:b w:val="0"/>
         <w:bCs w:val="0"/>
         <w:color w:val="000000" w:themeColor="text1"/>
@@ -8248,6 +8061,7 @@
       <w:spacing w:after="0" w:line="240" w:lineRule="auto"/>
     </w:pPr>
     <w:rPr>
+      <w:rFonts w:asciiTheme="majorHAnsi" w:eastAsiaTheme="majorEastAsia" w:hAnsiTheme="majorHAnsi" w:cstheme="majorBidi"/>
       <w:color w:val="000000" w:themeColor="text1"/>
     </w:rPr>
     <w:tblPr>
@@ -8267,7 +8081,6 @@
     </w:tcPr>
     <w:tblStylePr w:type="firstRow">
       <w:rPr>
-        <w:rFonts w:ascii="Arial" w:eastAsia="Arial" w:hAnsi="Arial" w:cs="Arial"/>
         <w:b/>
         <w:bCs/>
         <w:color w:val="000000" w:themeColor="text1"/>
@@ -8279,7 +8092,6 @@
     </w:tblStylePr>
     <w:tblStylePr w:type="lastRow">
       <w:rPr>
-        <w:rFonts w:ascii="Arial" w:eastAsia="Arial" w:hAnsi="Arial" w:cs="Arial"/>
         <w:b/>
         <w:bCs/>
         <w:color w:val="000000" w:themeColor="text1"/>
@@ -8299,7 +8111,6 @@
     </w:tblStylePr>
     <w:tblStylePr w:type="firstCol">
       <w:rPr>
-        <w:rFonts w:ascii="Arial" w:eastAsia="Arial" w:hAnsi="Arial" w:cs="Arial"/>
         <w:b/>
         <w:bCs/>
         <w:color w:val="000000" w:themeColor="text1"/>
@@ -8319,7 +8130,6 @@
     </w:tblStylePr>
     <w:tblStylePr w:type="lastCol">
       <w:rPr>
-        <w:rFonts w:ascii="Arial" w:eastAsia="Arial" w:hAnsi="Arial" w:cs="Arial"/>
         <w:b w:val="0"/>
         <w:bCs w:val="0"/>
         <w:color w:val="000000" w:themeColor="text1"/>
@@ -8369,6 +8179,7 @@
       <w:spacing w:after="0" w:line="240" w:lineRule="auto"/>
     </w:pPr>
     <w:rPr>
+      <w:rFonts w:asciiTheme="majorHAnsi" w:eastAsiaTheme="majorEastAsia" w:hAnsiTheme="majorHAnsi" w:cstheme="majorBidi"/>
       <w:color w:val="000000" w:themeColor="text1"/>
     </w:rPr>
     <w:tblPr>
@@ -8388,7 +8199,6 @@
     </w:tcPr>
     <w:tblStylePr w:type="firstRow">
       <w:rPr>
-        <w:rFonts w:ascii="Arial" w:eastAsia="Arial" w:hAnsi="Arial" w:cs="Arial"/>
         <w:b/>
         <w:bCs/>
         <w:color w:val="000000" w:themeColor="text1"/>
@@ -8400,7 +8210,6 @@
     </w:tblStylePr>
     <w:tblStylePr w:type="lastRow">
       <w:rPr>
-        <w:rFonts w:ascii="Arial" w:eastAsia="Arial" w:hAnsi="Arial" w:cs="Arial"/>
         <w:b/>
         <w:bCs/>
         <w:color w:val="000000" w:themeColor="text1"/>
@@ -8420,7 +8229,6 @@
     </w:tblStylePr>
     <w:tblStylePr w:type="firstCol">
       <w:rPr>
-        <w:rFonts w:ascii="Arial" w:eastAsia="Arial" w:hAnsi="Arial" w:cs="Arial"/>
         <w:b/>
         <w:bCs/>
         <w:color w:val="000000" w:themeColor="text1"/>
@@ -8440,7 +8248,6 @@
     </w:tblStylePr>
     <w:tblStylePr w:type="lastCol">
       <w:rPr>
-        <w:rFonts w:ascii="Arial" w:eastAsia="Arial" w:hAnsi="Arial" w:cs="Arial"/>
         <w:b w:val="0"/>
         <w:bCs w:val="0"/>
         <w:color w:val="000000" w:themeColor="text1"/>
@@ -8490,6 +8297,7 @@
       <w:spacing w:after="0" w:line="240" w:lineRule="auto"/>
     </w:pPr>
     <w:rPr>
+      <w:rFonts w:asciiTheme="majorHAnsi" w:eastAsiaTheme="majorEastAsia" w:hAnsiTheme="majorHAnsi" w:cstheme="majorBidi"/>
       <w:color w:val="000000" w:themeColor="text1"/>
     </w:rPr>
     <w:tblPr>
@@ -8509,7 +8317,6 @@
     </w:tcPr>
     <w:tblStylePr w:type="firstRow">
       <w:rPr>
-        <w:rFonts w:ascii="Arial" w:eastAsia="Arial" w:hAnsi="Arial" w:cs="Arial"/>
         <w:b/>
         <w:bCs/>
         <w:color w:val="000000" w:themeColor="text1"/>
@@ -8521,7 +8328,6 @@
     </w:tblStylePr>
     <w:tblStylePr w:type="lastRow">
       <w:rPr>
-        <w:rFonts w:ascii="Arial" w:eastAsia="Arial" w:hAnsi="Arial" w:cs="Arial"/>
         <w:b/>
         <w:bCs/>
         <w:color w:val="000000" w:themeColor="text1"/>
@@ -8541,7 +8347,6 @@
     </w:tblStylePr>
     <w:tblStylePr w:type="firstCol">
       <w:rPr>
-        <w:rFonts w:ascii="Arial" w:eastAsia="Arial" w:hAnsi="Arial" w:cs="Arial"/>
         <w:b/>
         <w:bCs/>
         <w:color w:val="000000" w:themeColor="text1"/>
@@ -8561,7 +8366,6 @@
     </w:tblStylePr>
     <w:tblStylePr w:type="lastCol">
       <w:rPr>
-        <w:rFonts w:ascii="Arial" w:eastAsia="Arial" w:hAnsi="Arial" w:cs="Arial"/>
         <w:b w:val="0"/>
         <w:bCs w:val="0"/>
         <w:color w:val="000000" w:themeColor="text1"/>
@@ -8627,7 +8431,6 @@
     </w:tcPr>
     <w:tblStylePr w:type="firstRow">
       <w:rPr>
-        <w:rFonts w:ascii="Arial" w:eastAsia="Arial" w:hAnsi="Arial" w:cs="Arial"/>
         <w:b/>
         <w:bCs/>
         <w:i w:val="0"/>
@@ -8649,7 +8452,6 @@
     </w:tblStylePr>
     <w:tblStylePr w:type="lastRow">
       <w:rPr>
-        <w:rFonts w:ascii="Arial" w:eastAsia="Arial" w:hAnsi="Arial" w:cs="Arial"/>
         <w:b/>
         <w:bCs/>
         <w:i w:val="0"/>
@@ -8671,7 +8473,6 @@
     </w:tblStylePr>
     <w:tblStylePr w:type="firstCol">
       <w:rPr>
-        <w:rFonts w:ascii="Arial" w:eastAsia="Arial" w:hAnsi="Arial" w:cs="Arial"/>
         <w:b/>
         <w:bCs/>
         <w:i w:val="0"/>
@@ -8691,7 +8492,6 @@
     </w:tblStylePr>
     <w:tblStylePr w:type="lastCol">
       <w:rPr>
-        <w:rFonts w:ascii="Arial" w:eastAsia="Arial" w:hAnsi="Arial" w:cs="Arial"/>
         <w:b/>
         <w:bCs/>
         <w:i w:val="0"/>
@@ -8765,7 +8565,6 @@
     </w:tcPr>
     <w:tblStylePr w:type="firstRow">
       <w:rPr>
-        <w:rFonts w:ascii="Arial" w:eastAsia="Arial" w:hAnsi="Arial" w:cs="Arial"/>
         <w:b/>
         <w:bCs/>
         <w:i w:val="0"/>
@@ -8787,7 +8586,6 @@
     </w:tblStylePr>
     <w:tblStylePr w:type="lastRow">
       <w:rPr>
-        <w:rFonts w:ascii="Arial" w:eastAsia="Arial" w:hAnsi="Arial" w:cs="Arial"/>
         <w:b/>
         <w:bCs/>
         <w:i w:val="0"/>
@@ -8809,7 +8607,6 @@
     </w:tblStylePr>
     <w:tblStylePr w:type="firstCol">
       <w:rPr>
-        <w:rFonts w:ascii="Arial" w:eastAsia="Arial" w:hAnsi="Arial" w:cs="Arial"/>
         <w:b/>
         <w:bCs/>
         <w:i w:val="0"/>
@@ -8829,7 +8626,6 @@
     </w:tblStylePr>
     <w:tblStylePr w:type="lastCol">
       <w:rPr>
-        <w:rFonts w:ascii="Arial" w:eastAsia="Arial" w:hAnsi="Arial" w:cs="Arial"/>
         <w:b/>
         <w:bCs/>
         <w:i w:val="0"/>
@@ -8903,7 +8699,6 @@
     </w:tcPr>
     <w:tblStylePr w:type="firstRow">
       <w:rPr>
-        <w:rFonts w:ascii="Arial" w:eastAsia="Arial" w:hAnsi="Arial" w:cs="Arial"/>
         <w:b/>
         <w:bCs/>
         <w:i w:val="0"/>
@@ -8925,7 +8720,6 @@
     </w:tblStylePr>
     <w:tblStylePr w:type="lastRow">
       <w:rPr>
-        <w:rFonts w:ascii="Arial" w:eastAsia="Arial" w:hAnsi="Arial" w:cs="Arial"/>
         <w:b/>
         <w:bCs/>
         <w:i w:val="0"/>
@@ -8947,7 +8741,6 @@
     </w:tblStylePr>
     <w:tblStylePr w:type="firstCol">
       <w:rPr>
-        <w:rFonts w:ascii="Arial" w:eastAsia="Arial" w:hAnsi="Arial" w:cs="Arial"/>
         <w:b/>
         <w:bCs/>
         <w:i w:val="0"/>
@@ -8967,7 +8760,6 @@
     </w:tblStylePr>
     <w:tblStylePr w:type="lastCol">
       <w:rPr>
-        <w:rFonts w:ascii="Arial" w:eastAsia="Arial" w:hAnsi="Arial" w:cs="Arial"/>
         <w:b/>
         <w:bCs/>
         <w:i w:val="0"/>
@@ -9041,7 +8833,6 @@
     </w:tcPr>
     <w:tblStylePr w:type="firstRow">
       <w:rPr>
-        <w:rFonts w:ascii="Arial" w:eastAsia="Arial" w:hAnsi="Arial" w:cs="Arial"/>
         <w:b/>
         <w:bCs/>
         <w:i w:val="0"/>
@@ -9063,7 +8854,6 @@
     </w:tblStylePr>
     <w:tblStylePr w:type="lastRow">
       <w:rPr>
-        <w:rFonts w:ascii="Arial" w:eastAsia="Arial" w:hAnsi="Arial" w:cs="Arial"/>
         <w:b/>
         <w:bCs/>
         <w:i w:val="0"/>
@@ -9085,7 +8875,6 @@
     </w:tblStylePr>
     <w:tblStylePr w:type="firstCol">
       <w:rPr>
-        <w:rFonts w:ascii="Arial" w:eastAsia="Arial" w:hAnsi="Arial" w:cs="Arial"/>
         <w:b/>
         <w:bCs/>
         <w:i w:val="0"/>
@@ -9105,7 +8894,6 @@
     </w:tblStylePr>
     <w:tblStylePr w:type="lastCol">
       <w:rPr>
-        <w:rFonts w:ascii="Arial" w:eastAsia="Arial" w:hAnsi="Arial" w:cs="Arial"/>
         <w:b/>
         <w:bCs/>
         <w:i w:val="0"/>
@@ -9179,7 +8967,6 @@
     </w:tcPr>
     <w:tblStylePr w:type="firstRow">
       <w:rPr>
-        <w:rFonts w:ascii="Arial" w:eastAsia="Arial" w:hAnsi="Arial" w:cs="Arial"/>
         <w:b/>
         <w:bCs/>
         <w:i w:val="0"/>
@@ -9201,7 +8988,6 @@
     </w:tblStylePr>
     <w:tblStylePr w:type="lastRow">
       <w:rPr>
-        <w:rFonts w:ascii="Arial" w:eastAsia="Arial" w:hAnsi="Arial" w:cs="Arial"/>
         <w:b/>
         <w:bCs/>
         <w:i w:val="0"/>
@@ -9223,7 +9009,6 @@
     </w:tblStylePr>
     <w:tblStylePr w:type="firstCol">
       <w:rPr>
-        <w:rFonts w:ascii="Arial" w:eastAsia="Arial" w:hAnsi="Arial" w:cs="Arial"/>
         <w:b/>
         <w:bCs/>
         <w:i w:val="0"/>
@@ -9243,7 +9028,6 @@
     </w:tblStylePr>
     <w:tblStylePr w:type="lastCol">
       <w:rPr>
-        <w:rFonts w:ascii="Arial" w:eastAsia="Arial" w:hAnsi="Arial" w:cs="Arial"/>
         <w:b/>
         <w:bCs/>
         <w:i w:val="0"/>
@@ -9317,7 +9101,6 @@
     </w:tcPr>
     <w:tblStylePr w:type="firstRow">
       <w:rPr>
-        <w:rFonts w:ascii="Arial" w:eastAsia="Arial" w:hAnsi="Arial" w:cs="Arial"/>
         <w:b/>
         <w:bCs/>
         <w:i w:val="0"/>
@@ -9339,7 +9122,6 @@
     </w:tblStylePr>
     <w:tblStylePr w:type="lastRow">
       <w:rPr>
-        <w:rFonts w:ascii="Arial" w:eastAsia="Arial" w:hAnsi="Arial" w:cs="Arial"/>
         <w:b/>
         <w:bCs/>
         <w:i w:val="0"/>
@@ -9361,7 +9143,6 @@
     </w:tblStylePr>
     <w:tblStylePr w:type="firstCol">
       <w:rPr>
-        <w:rFonts w:ascii="Arial" w:eastAsia="Arial" w:hAnsi="Arial" w:cs="Arial"/>
         <w:b/>
         <w:bCs/>
         <w:i w:val="0"/>
@@ -9381,7 +9162,6 @@
     </w:tblStylePr>
     <w:tblStylePr w:type="lastCol">
       <w:rPr>
-        <w:rFonts w:ascii="Arial" w:eastAsia="Arial" w:hAnsi="Arial" w:cs="Arial"/>
         <w:b/>
         <w:bCs/>
         <w:i w:val="0"/>
@@ -9455,7 +9235,6 @@
     </w:tcPr>
     <w:tblStylePr w:type="firstRow">
       <w:rPr>
-        <w:rFonts w:ascii="Arial" w:eastAsia="Arial" w:hAnsi="Arial" w:cs="Arial"/>
         <w:b/>
         <w:bCs/>
         <w:i w:val="0"/>
@@ -9477,7 +9256,6 @@
     </w:tblStylePr>
     <w:tblStylePr w:type="lastRow">
       <w:rPr>
-        <w:rFonts w:ascii="Arial" w:eastAsia="Arial" w:hAnsi="Arial" w:cs="Arial"/>
         <w:b/>
         <w:bCs/>
         <w:i w:val="0"/>
@@ -9499,7 +9277,6 @@
     </w:tblStylePr>
     <w:tblStylePr w:type="firstCol">
       <w:rPr>
-        <w:rFonts w:ascii="Arial" w:eastAsia="Arial" w:hAnsi="Arial" w:cs="Arial"/>
         <w:b/>
         <w:bCs/>
         <w:i w:val="0"/>
@@ -9519,7 +9296,6 @@
     </w:tblStylePr>
     <w:tblStylePr w:type="lastCol">
       <w:rPr>
-        <w:rFonts w:ascii="Arial" w:eastAsia="Arial" w:hAnsi="Arial" w:cs="Arial"/>
         <w:b/>
         <w:bCs/>
         <w:i w:val="0"/>
@@ -9588,7 +9364,6 @@
     </w:tcPr>
     <w:tblStylePr w:type="firstRow">
       <w:rPr>
-        <w:rFonts w:ascii="Arial" w:eastAsia="Arial" w:hAnsi="Arial" w:cs="Arial"/>
         <w:b/>
         <w:bCs/>
       </w:rPr>
@@ -9696,7 +9471,6 @@
     </w:tcPr>
     <w:tblStylePr w:type="firstRow">
       <w:rPr>
-        <w:rFonts w:ascii="Arial" w:eastAsia="Arial" w:hAnsi="Arial" w:cs="Arial"/>
         <w:b/>
         <w:bCs/>
       </w:rPr>
@@ -9804,7 +9578,6 @@
     </w:tcPr>
     <w:tblStylePr w:type="firstRow">
       <w:rPr>
-        <w:rFonts w:ascii="Arial" w:eastAsia="Arial" w:hAnsi="Arial" w:cs="Arial"/>
         <w:b/>
         <w:bCs/>
       </w:rPr>
@@ -9912,7 +9685,6 @@
     </w:tcPr>
     <w:tblStylePr w:type="firstRow">
       <w:rPr>
-        <w:rFonts w:ascii="Arial" w:eastAsia="Arial" w:hAnsi="Arial" w:cs="Arial"/>
         <w:b/>
         <w:bCs/>
       </w:rPr>
@@ -10020,7 +9792,6 @@
     </w:tcPr>
     <w:tblStylePr w:type="firstRow">
       <w:rPr>
-        <w:rFonts w:ascii="Arial" w:eastAsia="Arial" w:hAnsi="Arial" w:cs="Arial"/>
         <w:b/>
         <w:bCs/>
       </w:rPr>
@@ -10128,7 +9899,6 @@
     </w:tcPr>
     <w:tblStylePr w:type="firstRow">
       <w:rPr>
-        <w:rFonts w:ascii="Arial" w:eastAsia="Arial" w:hAnsi="Arial" w:cs="Arial"/>
         <w:b/>
         <w:bCs/>
       </w:rPr>
@@ -10236,7 +10006,6 @@
     </w:tcPr>
     <w:tblStylePr w:type="firstRow">
       <w:rPr>
-        <w:rFonts w:ascii="Arial" w:eastAsia="Arial" w:hAnsi="Arial" w:cs="Arial"/>
         <w:b/>
         <w:bCs/>
       </w:rPr>
@@ -10352,7 +10121,6 @@
     </w:tcPr>
     <w:tblStylePr w:type="firstRow">
       <w:rPr>
-        <w:rFonts w:ascii="Arial" w:eastAsia="Arial" w:hAnsi="Arial" w:cs="Arial"/>
         <w:b/>
         <w:bCs/>
       </w:rPr>
@@ -10371,7 +10139,6 @@
     </w:tblStylePr>
     <w:tblStylePr w:type="lastRow">
       <w:rPr>
-        <w:rFonts w:ascii="Arial" w:eastAsia="Arial" w:hAnsi="Arial" w:cs="Arial"/>
         <w:b/>
         <w:bCs/>
         <w:color w:val="FFFFFF" w:themeColor="background1"/>
@@ -10386,7 +10153,6 @@
     </w:tblStylePr>
     <w:tblStylePr w:type="firstCol">
       <w:rPr>
-        <w:rFonts w:ascii="Arial" w:eastAsia="Arial" w:hAnsi="Arial" w:cs="Arial"/>
         <w:color w:val="FFFFFF" w:themeColor="background1"/>
       </w:rPr>
       <w:tblPr/>
@@ -10404,7 +10170,6 @@
     </w:tblStylePr>
     <w:tblStylePr w:type="lastCol">
       <w:rPr>
-        <w:rFonts w:ascii="Arial" w:eastAsia="Arial" w:hAnsi="Arial" w:cs="Arial"/>
         <w:color w:val="FFFFFF" w:themeColor="background1"/>
       </w:rPr>
       <w:tblPr/>
@@ -10434,13 +10199,11 @@
     </w:tblStylePr>
     <w:tblStylePr w:type="neCell">
       <w:rPr>
-        <w:rFonts w:ascii="Arial" w:eastAsia="Arial" w:hAnsi="Arial" w:cs="Arial"/>
         <w:color w:val="000000" w:themeColor="text1"/>
       </w:rPr>
     </w:tblStylePr>
     <w:tblStylePr w:type="nwCell">
       <w:rPr>
-        <w:rFonts w:ascii="Arial" w:eastAsia="Arial" w:hAnsi="Arial" w:cs="Arial"/>
         <w:color w:val="000000" w:themeColor="text1"/>
       </w:rPr>
     </w:tblStylePr>
@@ -10473,7 +10236,6 @@
     </w:tcPr>
     <w:tblStylePr w:type="firstRow">
       <w:rPr>
-        <w:rFonts w:ascii="Arial" w:eastAsia="Arial" w:hAnsi="Arial" w:cs="Arial"/>
         <w:b/>
         <w:bCs/>
       </w:rPr>
@@ -10492,7 +10254,6 @@
     </w:tblStylePr>
     <w:tblStylePr w:type="lastRow">
       <w:rPr>
-        <w:rFonts w:ascii="Arial" w:eastAsia="Arial" w:hAnsi="Arial" w:cs="Arial"/>
         <w:b/>
         <w:bCs/>
         <w:color w:val="FFFFFF" w:themeColor="background1"/>
@@ -10507,7 +10268,6 @@
     </w:tblStylePr>
     <w:tblStylePr w:type="firstCol">
       <w:rPr>
-        <w:rFonts w:ascii="Arial" w:eastAsia="Arial" w:hAnsi="Arial" w:cs="Arial"/>
         <w:color w:val="FFFFFF" w:themeColor="background1"/>
       </w:rPr>
       <w:tblPr/>
@@ -10525,7 +10285,6 @@
     </w:tblStylePr>
     <w:tblStylePr w:type="lastCol">
       <w:rPr>
-        <w:rFonts w:ascii="Arial" w:eastAsia="Arial" w:hAnsi="Arial" w:cs="Arial"/>
         <w:color w:val="FFFFFF" w:themeColor="background1"/>
       </w:rPr>
       <w:tblPr/>
@@ -10555,13 +10314,11 @@
     </w:tblStylePr>
     <w:tblStylePr w:type="neCell">
       <w:rPr>
-        <w:rFonts w:ascii="Arial" w:eastAsia="Arial" w:hAnsi="Arial" w:cs="Arial"/>
         <w:color w:val="000000" w:themeColor="text1"/>
       </w:rPr>
     </w:tblStylePr>
     <w:tblStylePr w:type="nwCell">
       <w:rPr>
-        <w:rFonts w:ascii="Arial" w:eastAsia="Arial" w:hAnsi="Arial" w:cs="Arial"/>
         <w:color w:val="000000" w:themeColor="text1"/>
       </w:rPr>
     </w:tblStylePr>
@@ -10594,7 +10351,6 @@
     </w:tcPr>
     <w:tblStylePr w:type="firstRow">
       <w:rPr>
-        <w:rFonts w:ascii="Arial" w:eastAsia="Arial" w:hAnsi="Arial" w:cs="Arial"/>
         <w:b/>
         <w:bCs/>
       </w:rPr>
@@ -10613,7 +10369,6 @@
     </w:tblStylePr>
     <w:tblStylePr w:type="lastRow">
       <w:rPr>
-        <w:rFonts w:ascii="Arial" w:eastAsia="Arial" w:hAnsi="Arial" w:cs="Arial"/>
         <w:b/>
         <w:bCs/>
         <w:color w:val="FFFFFF" w:themeColor="background1"/>
@@ -10628,7 +10383,6 @@
     </w:tblStylePr>
     <w:tblStylePr w:type="firstCol">
       <w:rPr>
-        <w:rFonts w:ascii="Arial" w:eastAsia="Arial" w:hAnsi="Arial" w:cs="Arial"/>
         <w:color w:val="FFFFFF" w:themeColor="background1"/>
       </w:rPr>
       <w:tblPr/>
@@ -10646,7 +10400,6 @@
     </w:tblStylePr>
     <w:tblStylePr w:type="lastCol">
       <w:rPr>
-        <w:rFonts w:ascii="Arial" w:eastAsia="Arial" w:hAnsi="Arial" w:cs="Arial"/>
         <w:color w:val="FFFFFF" w:themeColor="background1"/>
       </w:rPr>
       <w:tblPr/>
@@ -10676,13 +10429,11 @@
     </w:tblStylePr>
     <w:tblStylePr w:type="neCell">
       <w:rPr>
-        <w:rFonts w:ascii="Arial" w:eastAsia="Arial" w:hAnsi="Arial" w:cs="Arial"/>
         <w:color w:val="000000" w:themeColor="text1"/>
       </w:rPr>
     </w:tblStylePr>
     <w:tblStylePr w:type="nwCell">
       <w:rPr>
-        <w:rFonts w:ascii="Arial" w:eastAsia="Arial" w:hAnsi="Arial" w:cs="Arial"/>
         <w:color w:val="000000" w:themeColor="text1"/>
       </w:rPr>
     </w:tblStylePr>
@@ -10715,7 +10466,6 @@
     </w:tcPr>
     <w:tblStylePr w:type="firstRow">
       <w:rPr>
-        <w:rFonts w:ascii="Arial" w:eastAsia="Arial" w:hAnsi="Arial" w:cs="Arial"/>
         <w:b/>
         <w:bCs/>
       </w:rPr>
@@ -10734,7 +10484,6 @@
     </w:tblStylePr>
     <w:tblStylePr w:type="lastRow">
       <w:rPr>
-        <w:rFonts w:ascii="Arial" w:eastAsia="Arial" w:hAnsi="Arial" w:cs="Arial"/>
         <w:b/>
         <w:bCs/>
         <w:color w:val="FFFFFF" w:themeColor="background1"/>
@@ -10749,7 +10498,6 @@
     </w:tblStylePr>
     <w:tblStylePr w:type="firstCol">
       <w:rPr>
-        <w:rFonts w:ascii="Arial" w:eastAsia="Arial" w:hAnsi="Arial" w:cs="Arial"/>
         <w:color w:val="FFFFFF" w:themeColor="background1"/>
       </w:rPr>
       <w:tblPr/>
@@ -10767,7 +10515,6 @@
     </w:tblStylePr>
     <w:tblStylePr w:type="lastCol">
       <w:rPr>
-        <w:rFonts w:ascii="Arial" w:eastAsia="Arial" w:hAnsi="Arial" w:cs="Arial"/>
         <w:color w:val="FFFFFF" w:themeColor="background1"/>
       </w:rPr>
       <w:tblPr/>
@@ -10824,7 +10571,6 @@
     </w:tcPr>
     <w:tblStylePr w:type="firstRow">
       <w:rPr>
-        <w:rFonts w:ascii="Arial" w:eastAsia="Arial" w:hAnsi="Arial" w:cs="Arial"/>
         <w:b/>
         <w:bCs/>
       </w:rPr>
@@ -10843,7 +10589,6 @@
     </w:tblStylePr>
     <w:tblStylePr w:type="lastRow">
       <w:rPr>
-        <w:rFonts w:ascii="Arial" w:eastAsia="Arial" w:hAnsi="Arial" w:cs="Arial"/>
         <w:b/>
         <w:bCs/>
         <w:color w:val="FFFFFF" w:themeColor="background1"/>
@@ -10858,7 +10603,6 @@
     </w:tblStylePr>
     <w:tblStylePr w:type="firstCol">
       <w:rPr>
-        <w:rFonts w:ascii="Arial" w:eastAsia="Arial" w:hAnsi="Arial" w:cs="Arial"/>
         <w:color w:val="FFFFFF" w:themeColor="background1"/>
       </w:rPr>
       <w:tblPr/>
@@ -10876,7 +10620,6 @@
     </w:tblStylePr>
     <w:tblStylePr w:type="lastCol">
       <w:rPr>
-        <w:rFonts w:ascii="Arial" w:eastAsia="Arial" w:hAnsi="Arial" w:cs="Arial"/>
         <w:color w:val="FFFFFF" w:themeColor="background1"/>
       </w:rPr>
       <w:tblPr/>
@@ -10906,13 +10649,11 @@
     </w:tblStylePr>
     <w:tblStylePr w:type="neCell">
       <w:rPr>
-        <w:rFonts w:ascii="Arial" w:eastAsia="Arial" w:hAnsi="Arial" w:cs="Arial"/>
         <w:color w:val="000000" w:themeColor="text1"/>
       </w:rPr>
     </w:tblStylePr>
     <w:tblStylePr w:type="nwCell">
       <w:rPr>
-        <w:rFonts w:ascii="Arial" w:eastAsia="Arial" w:hAnsi="Arial" w:cs="Arial"/>
         <w:color w:val="000000" w:themeColor="text1"/>
       </w:rPr>
     </w:tblStylePr>
@@ -10945,7 +10686,6 @@
     </w:tcPr>
     <w:tblStylePr w:type="firstRow">
       <w:rPr>
-        <w:rFonts w:ascii="Arial" w:eastAsia="Arial" w:hAnsi="Arial" w:cs="Arial"/>
         <w:b/>
         <w:bCs/>
       </w:rPr>
@@ -10964,7 +10704,6 @@
     </w:tblStylePr>
     <w:tblStylePr w:type="lastRow">
       <w:rPr>
-        <w:rFonts w:ascii="Arial" w:eastAsia="Arial" w:hAnsi="Arial" w:cs="Arial"/>
         <w:b/>
         <w:bCs/>
         <w:color w:val="FFFFFF" w:themeColor="background1"/>
@@ -10979,7 +10718,6 @@
     </w:tblStylePr>
     <w:tblStylePr w:type="firstCol">
       <w:rPr>
-        <w:rFonts w:ascii="Arial" w:eastAsia="Arial" w:hAnsi="Arial" w:cs="Arial"/>
         <w:color w:val="FFFFFF" w:themeColor="background1"/>
       </w:rPr>
       <w:tblPr/>
@@ -10997,7 +10735,6 @@
     </w:tblStylePr>
     <w:tblStylePr w:type="lastCol">
       <w:rPr>
-        <w:rFonts w:ascii="Arial" w:eastAsia="Arial" w:hAnsi="Arial" w:cs="Arial"/>
         <w:color w:val="FFFFFF" w:themeColor="background1"/>
       </w:rPr>
       <w:tblPr/>
@@ -11027,13 +10764,11 @@
     </w:tblStylePr>
     <w:tblStylePr w:type="neCell">
       <w:rPr>
-        <w:rFonts w:ascii="Arial" w:eastAsia="Arial" w:hAnsi="Arial" w:cs="Arial"/>
         <w:color w:val="000000" w:themeColor="text1"/>
       </w:rPr>
     </w:tblStylePr>
     <w:tblStylePr w:type="nwCell">
       <w:rPr>
-        <w:rFonts w:ascii="Arial" w:eastAsia="Arial" w:hAnsi="Arial" w:cs="Arial"/>
         <w:color w:val="000000" w:themeColor="text1"/>
       </w:rPr>
     </w:tblStylePr>
@@ -11066,7 +10801,6 @@
     </w:tcPr>
     <w:tblStylePr w:type="firstRow">
       <w:rPr>
-        <w:rFonts w:ascii="Arial" w:eastAsia="Arial" w:hAnsi="Arial" w:cs="Arial"/>
         <w:b/>
         <w:bCs/>
       </w:rPr>
@@ -11085,7 +10819,6 @@
     </w:tblStylePr>
     <w:tblStylePr w:type="lastRow">
       <w:rPr>
-        <w:rFonts w:ascii="Arial" w:eastAsia="Arial" w:hAnsi="Arial" w:cs="Arial"/>
         <w:b/>
         <w:bCs/>
         <w:color w:val="FFFFFF" w:themeColor="background1"/>
@@ -11100,7 +10833,6 @@
     </w:tblStylePr>
     <w:tblStylePr w:type="firstCol">
       <w:rPr>
-        <w:rFonts w:ascii="Arial" w:eastAsia="Arial" w:hAnsi="Arial" w:cs="Arial"/>
         <w:color w:val="FFFFFF" w:themeColor="background1"/>
       </w:rPr>
       <w:tblPr/>
@@ -11118,7 +10850,6 @@
     </w:tblStylePr>
     <w:tblStylePr w:type="lastCol">
       <w:rPr>
-        <w:rFonts w:ascii="Arial" w:eastAsia="Arial" w:hAnsi="Arial" w:cs="Arial"/>
         <w:color w:val="FFFFFF" w:themeColor="background1"/>
       </w:rPr>
       <w:tblPr/>
@@ -11148,13 +10879,11 @@
     </w:tblStylePr>
     <w:tblStylePr w:type="neCell">
       <w:rPr>
-        <w:rFonts w:ascii="Arial" w:eastAsia="Arial" w:hAnsi="Arial" w:cs="Arial"/>
         <w:color w:val="000000" w:themeColor="text1"/>
       </w:rPr>
     </w:tblStylePr>
     <w:tblStylePr w:type="nwCell">
       <w:rPr>
-        <w:rFonts w:ascii="Arial" w:eastAsia="Arial" w:hAnsi="Arial" w:cs="Arial"/>
         <w:color w:val="000000" w:themeColor="text1"/>
       </w:rPr>
     </w:tblStylePr>
@@ -11179,7 +10908,6 @@
     </w:tcPr>
     <w:tblStylePr w:type="firstRow">
       <w:rPr>
-        <w:rFonts w:ascii="Arial" w:eastAsia="Arial" w:hAnsi="Arial" w:cs="Arial"/>
         <w:b/>
         <w:bCs/>
         <w:color w:val="FFFFFF" w:themeColor="background1"/>
@@ -11194,7 +10922,6 @@
     </w:tblStylePr>
     <w:tblStylePr w:type="lastRow">
       <w:rPr>
-        <w:rFonts w:ascii="Arial" w:eastAsia="Arial" w:hAnsi="Arial" w:cs="Arial"/>
         <w:b/>
         <w:bCs/>
         <w:color w:val="9E3A38" w:themeColor="accent2" w:themeShade="CC"/>
@@ -11209,14 +10936,12 @@
     </w:tblStylePr>
     <w:tblStylePr w:type="firstCol">
       <w:rPr>
-        <w:rFonts w:ascii="Arial" w:eastAsia="Arial" w:hAnsi="Arial" w:cs="Arial"/>
         <w:b/>
         <w:bCs/>
       </w:rPr>
     </w:tblStylePr>
     <w:tblStylePr w:type="lastCol">
       <w:rPr>
-        <w:rFonts w:ascii="Arial" w:eastAsia="Arial" w:hAnsi="Arial" w:cs="Arial"/>
         <w:b/>
         <w:bCs/>
       </w:rPr>
@@ -11262,7 +10987,6 @@
     </w:tcPr>
     <w:tblStylePr w:type="firstRow">
       <w:rPr>
-        <w:rFonts w:ascii="Arial" w:eastAsia="Arial" w:hAnsi="Arial" w:cs="Arial"/>
         <w:b/>
         <w:bCs/>
         <w:color w:val="FFFFFF" w:themeColor="background1"/>
@@ -11277,7 +11001,6 @@
     </w:tblStylePr>
     <w:tblStylePr w:type="lastRow">
       <w:rPr>
-        <w:rFonts w:ascii="Arial" w:eastAsia="Arial" w:hAnsi="Arial" w:cs="Arial"/>
         <w:b/>
         <w:bCs/>
         <w:color w:val="9E3A38" w:themeColor="accent2" w:themeShade="CC"/>
@@ -11292,14 +11015,12 @@
     </w:tblStylePr>
     <w:tblStylePr w:type="firstCol">
       <w:rPr>
-        <w:rFonts w:ascii="Arial" w:eastAsia="Arial" w:hAnsi="Arial" w:cs="Arial"/>
         <w:b/>
         <w:bCs/>
       </w:rPr>
     </w:tblStylePr>
     <w:tblStylePr w:type="lastCol">
       <w:rPr>
-        <w:rFonts w:ascii="Arial" w:eastAsia="Arial" w:hAnsi="Arial" w:cs="Arial"/>
         <w:b/>
         <w:bCs/>
       </w:rPr>
@@ -11345,7 +11066,6 @@
     </w:tcPr>
     <w:tblStylePr w:type="firstRow">
       <w:rPr>
-        <w:rFonts w:ascii="Arial" w:eastAsia="Arial" w:hAnsi="Arial" w:cs="Arial"/>
         <w:b/>
         <w:bCs/>
         <w:color w:val="FFFFFF" w:themeColor="background1"/>
@@ -11360,7 +11080,6 @@
     </w:tblStylePr>
     <w:tblStylePr w:type="lastRow">
       <w:rPr>
-        <w:rFonts w:ascii="Arial" w:eastAsia="Arial" w:hAnsi="Arial" w:cs="Arial"/>
         <w:b/>
         <w:bCs/>
         <w:color w:val="9E3A38" w:themeColor="accent2" w:themeShade="CC"/>
@@ -11375,14 +11094,12 @@
     </w:tblStylePr>
     <w:tblStylePr w:type="firstCol">
       <w:rPr>
-        <w:rFonts w:ascii="Arial" w:eastAsia="Arial" w:hAnsi="Arial" w:cs="Arial"/>
         <w:b/>
         <w:bCs/>
       </w:rPr>
     </w:tblStylePr>
     <w:tblStylePr w:type="lastCol">
       <w:rPr>
-        <w:rFonts w:ascii="Arial" w:eastAsia="Arial" w:hAnsi="Arial" w:cs="Arial"/>
         <w:b/>
         <w:bCs/>
       </w:rPr>
@@ -11428,7 +11145,6 @@
     </w:tcPr>
     <w:tblStylePr w:type="firstRow">
       <w:rPr>
-        <w:rFonts w:ascii="Arial" w:eastAsia="Arial" w:hAnsi="Arial" w:cs="Arial"/>
         <w:b/>
         <w:bCs/>
         <w:color w:val="FFFFFF" w:themeColor="background1"/>
@@ -11443,7 +11159,6 @@
     </w:tblStylePr>
     <w:tblStylePr w:type="lastRow">
       <w:rPr>
-        <w:rFonts w:ascii="Arial" w:eastAsia="Arial" w:hAnsi="Arial" w:cs="Arial"/>
         <w:b/>
         <w:bCs/>
         <w:color w:val="664E82" w:themeColor="accent4" w:themeShade="CC"/>
@@ -11458,14 +11173,12 @@
     </w:tblStylePr>
     <w:tblStylePr w:type="firstCol">
       <w:rPr>
-        <w:rFonts w:ascii="Arial" w:eastAsia="Arial" w:hAnsi="Arial" w:cs="Arial"/>
         <w:b/>
         <w:bCs/>
       </w:rPr>
     </w:tblStylePr>
     <w:tblStylePr w:type="lastCol">
       <w:rPr>
-        <w:rFonts w:ascii="Arial" w:eastAsia="Arial" w:hAnsi="Arial" w:cs="Arial"/>
         <w:b/>
         <w:bCs/>
       </w:rPr>
@@ -11511,7 +11224,6 @@
     </w:tcPr>
     <w:tblStylePr w:type="firstRow">
       <w:rPr>
-        <w:rFonts w:ascii="Arial" w:eastAsia="Arial" w:hAnsi="Arial" w:cs="Arial"/>
         <w:b/>
         <w:bCs/>
         <w:color w:val="FFFFFF" w:themeColor="background1"/>
@@ -11526,7 +11238,6 @@
     </w:tblStylePr>
     <w:tblStylePr w:type="lastRow">
       <w:rPr>
-        <w:rFonts w:ascii="Arial" w:eastAsia="Arial" w:hAnsi="Arial" w:cs="Arial"/>
         <w:b/>
         <w:bCs/>
         <w:color w:val="7E9C40" w:themeColor="accent3" w:themeShade="CC"/>
@@ -11541,14 +11252,12 @@
     </w:tblStylePr>
     <w:tblStylePr w:type="firstCol">
       <w:rPr>
-        <w:rFonts w:ascii="Arial" w:eastAsia="Arial" w:hAnsi="Arial" w:cs="Arial"/>
         <w:b/>
         <w:bCs/>
       </w:rPr>
     </w:tblStylePr>
     <w:tblStylePr w:type="lastCol">
       <w:rPr>
-        <w:rFonts w:ascii="Arial" w:eastAsia="Arial" w:hAnsi="Arial" w:cs="Arial"/>
         <w:b/>
         <w:bCs/>
       </w:rPr>
@@ -11594,7 +11303,6 @@
     </w:tcPr>
     <w:tblStylePr w:type="firstRow">
       <w:rPr>
-        <w:rFonts w:ascii="Arial" w:eastAsia="Arial" w:hAnsi="Arial" w:cs="Arial"/>
         <w:b/>
         <w:bCs/>
         <w:color w:val="FFFFFF" w:themeColor="background1"/>
@@ -11609,7 +11317,6 @@
     </w:tblStylePr>
     <w:tblStylePr w:type="lastRow">
       <w:rPr>
-        <w:rFonts w:ascii="Arial" w:eastAsia="Arial" w:hAnsi="Arial" w:cs="Arial"/>
         <w:b/>
         <w:bCs/>
         <w:color w:val="F2730A" w:themeColor="accent6" w:themeShade="CC"/>
@@ -11624,14 +11331,12 @@
     </w:tblStylePr>
     <w:tblStylePr w:type="firstCol">
       <w:rPr>
-        <w:rFonts w:ascii="Arial" w:eastAsia="Arial" w:hAnsi="Arial" w:cs="Arial"/>
         <w:b/>
         <w:bCs/>
       </w:rPr>
     </w:tblStylePr>
     <w:tblStylePr w:type="lastCol">
       <w:rPr>
-        <w:rFonts w:ascii="Arial" w:eastAsia="Arial" w:hAnsi="Arial" w:cs="Arial"/>
         <w:b/>
         <w:bCs/>
       </w:rPr>
@@ -11677,7 +11382,6 @@
     </w:tcPr>
     <w:tblStylePr w:type="firstRow">
       <w:rPr>
-        <w:rFonts w:ascii="Arial" w:eastAsia="Arial" w:hAnsi="Arial" w:cs="Arial"/>
         <w:b/>
         <w:bCs/>
         <w:color w:val="FFFFFF" w:themeColor="background1"/>
@@ -11692,7 +11396,6 @@
     </w:tblStylePr>
     <w:tblStylePr w:type="lastRow">
       <w:rPr>
-        <w:rFonts w:ascii="Arial" w:eastAsia="Arial" w:hAnsi="Arial" w:cs="Arial"/>
         <w:b/>
         <w:bCs/>
         <w:color w:val="348DA5" w:themeColor="accent5" w:themeShade="CC"/>
@@ -11707,14 +11410,12 @@
     </w:tblStylePr>
     <w:tblStylePr w:type="firstCol">
       <w:rPr>
-        <w:rFonts w:ascii="Arial" w:eastAsia="Arial" w:hAnsi="Arial" w:cs="Arial"/>
         <w:b/>
         <w:bCs/>
       </w:rPr>
     </w:tblStylePr>
     <w:tblStylePr w:type="lastCol">
       <w:rPr>
-        <w:rFonts w:ascii="Arial" w:eastAsia="Arial" w:hAnsi="Arial" w:cs="Arial"/>
         <w:b/>
         <w:bCs/>
       </w:rPr>
@@ -11763,7 +11464,6 @@
     </w:tcPr>
     <w:tblStylePr w:type="firstRow">
       <w:rPr>
-        <w:rFonts w:ascii="Arial" w:eastAsia="Arial" w:hAnsi="Arial" w:cs="Arial"/>
         <w:b/>
         <w:bCs/>
       </w:rPr>
@@ -11774,7 +11474,6 @@
     </w:tblStylePr>
     <w:tblStylePr w:type="lastRow">
       <w:rPr>
-        <w:rFonts w:ascii="Arial" w:eastAsia="Arial" w:hAnsi="Arial" w:cs="Arial"/>
         <w:b/>
         <w:bCs/>
         <w:color w:val="000000" w:themeColor="text1"/>
@@ -11786,7 +11485,6 @@
     </w:tblStylePr>
     <w:tblStylePr w:type="firstCol">
       <w:rPr>
-        <w:rFonts w:ascii="Arial" w:eastAsia="Arial" w:hAnsi="Arial" w:cs="Arial"/>
         <w:color w:val="FFFFFF" w:themeColor="background1"/>
       </w:rPr>
       <w:tblPr/>
@@ -11796,7 +11494,6 @@
     </w:tblStylePr>
     <w:tblStylePr w:type="lastCol">
       <w:rPr>
-        <w:rFonts w:ascii="Arial" w:eastAsia="Arial" w:hAnsi="Arial" w:cs="Arial"/>
         <w:color w:val="FFFFFF" w:themeColor="background1"/>
       </w:rPr>
       <w:tblPr/>
@@ -11840,7 +11537,6 @@
     </w:tcPr>
     <w:tblStylePr w:type="firstRow">
       <w:rPr>
-        <w:rFonts w:ascii="Arial" w:eastAsia="Arial" w:hAnsi="Arial" w:cs="Arial"/>
         <w:b/>
         <w:bCs/>
       </w:rPr>
@@ -11851,7 +11547,6 @@
     </w:tblStylePr>
     <w:tblStylePr w:type="lastRow">
       <w:rPr>
-        <w:rFonts w:ascii="Arial" w:eastAsia="Arial" w:hAnsi="Arial" w:cs="Arial"/>
         <w:b/>
         <w:bCs/>
         <w:color w:val="000000" w:themeColor="text1"/>
@@ -11863,7 +11558,6 @@
     </w:tblStylePr>
     <w:tblStylePr w:type="firstCol">
       <w:rPr>
-        <w:rFonts w:ascii="Arial" w:eastAsia="Arial" w:hAnsi="Arial" w:cs="Arial"/>
         <w:color w:val="FFFFFF" w:themeColor="background1"/>
       </w:rPr>
       <w:tblPr/>
@@ -11873,7 +11567,6 @@
     </w:tblStylePr>
     <w:tblStylePr w:type="lastCol">
       <w:rPr>
-        <w:rFonts w:ascii="Arial" w:eastAsia="Arial" w:hAnsi="Arial" w:cs="Arial"/>
         <w:color w:val="FFFFFF" w:themeColor="background1"/>
       </w:rPr>
       <w:tblPr/>
@@ -11917,7 +11610,6 @@
     </w:tcPr>
     <w:tblStylePr w:type="firstRow">
       <w:rPr>
-        <w:rFonts w:ascii="Arial" w:eastAsia="Arial" w:hAnsi="Arial" w:cs="Arial"/>
         <w:b/>
         <w:bCs/>
       </w:rPr>
@@ -11928,7 +11620,6 @@
     </w:tblStylePr>
     <w:tblStylePr w:type="lastRow">
       <w:rPr>
-        <w:rFonts w:ascii="Arial" w:eastAsia="Arial" w:hAnsi="Arial" w:cs="Arial"/>
         <w:b/>
         <w:bCs/>
         <w:color w:val="000000" w:themeColor="text1"/>
@@ -11940,7 +11631,6 @@
     </w:tblStylePr>
     <w:tblStylePr w:type="firstCol">
       <w:rPr>
-        <w:rFonts w:ascii="Arial" w:eastAsia="Arial" w:hAnsi="Arial" w:cs="Arial"/>
         <w:color w:val="FFFFFF" w:themeColor="background1"/>
       </w:rPr>
       <w:tblPr/>
@@ -11950,7 +11640,6 @@
     </w:tblStylePr>
     <w:tblStylePr w:type="lastCol">
       <w:rPr>
-        <w:rFonts w:ascii="Arial" w:eastAsia="Arial" w:hAnsi="Arial" w:cs="Arial"/>
         <w:color w:val="FFFFFF" w:themeColor="background1"/>
       </w:rPr>
       <w:tblPr/>
@@ -11994,7 +11683,6 @@
     </w:tcPr>
     <w:tblStylePr w:type="firstRow">
       <w:rPr>
-        <w:rFonts w:ascii="Arial" w:eastAsia="Arial" w:hAnsi="Arial" w:cs="Arial"/>
         <w:b/>
         <w:bCs/>
       </w:rPr>
@@ -12005,7 +11693,6 @@
     </w:tblStylePr>
     <w:tblStylePr w:type="lastRow">
       <w:rPr>
-        <w:rFonts w:ascii="Arial" w:eastAsia="Arial" w:hAnsi="Arial" w:cs="Arial"/>
         <w:b/>
         <w:bCs/>
         <w:color w:val="000000" w:themeColor="text1"/>
@@ -12017,7 +11704,6 @@
     </w:tblStylePr>
     <w:tblStylePr w:type="firstCol">
       <w:rPr>
-        <w:rFonts w:ascii="Arial" w:eastAsia="Arial" w:hAnsi="Arial" w:cs="Arial"/>
         <w:color w:val="FFFFFF" w:themeColor="background1"/>
       </w:rPr>
       <w:tblPr/>
@@ -12027,7 +11713,6 @@
     </w:tblStylePr>
     <w:tblStylePr w:type="lastCol">
       <w:rPr>
-        <w:rFonts w:ascii="Arial" w:eastAsia="Arial" w:hAnsi="Arial" w:cs="Arial"/>
         <w:color w:val="FFFFFF" w:themeColor="background1"/>
       </w:rPr>
       <w:tblPr/>
@@ -12071,7 +11756,6 @@
     </w:tcPr>
     <w:tblStylePr w:type="firstRow">
       <w:rPr>
-        <w:rFonts w:ascii="Arial" w:eastAsia="Arial" w:hAnsi="Arial" w:cs="Arial"/>
         <w:b/>
         <w:bCs/>
       </w:rPr>
@@ -12082,7 +11766,6 @@
     </w:tblStylePr>
     <w:tblStylePr w:type="lastRow">
       <w:rPr>
-        <w:rFonts w:ascii="Arial" w:eastAsia="Arial" w:hAnsi="Arial" w:cs="Arial"/>
         <w:b/>
         <w:bCs/>
         <w:color w:val="000000" w:themeColor="text1"/>
@@ -12094,7 +11777,6 @@
     </w:tblStylePr>
     <w:tblStylePr w:type="firstCol">
       <w:rPr>
-        <w:rFonts w:ascii="Arial" w:eastAsia="Arial" w:hAnsi="Arial" w:cs="Arial"/>
         <w:color w:val="FFFFFF" w:themeColor="background1"/>
       </w:rPr>
       <w:tblPr/>
@@ -12104,7 +11786,6 @@
     </w:tblStylePr>
     <w:tblStylePr w:type="lastCol">
       <w:rPr>
-        <w:rFonts w:ascii="Arial" w:eastAsia="Arial" w:hAnsi="Arial" w:cs="Arial"/>
         <w:color w:val="FFFFFF" w:themeColor="background1"/>
       </w:rPr>
       <w:tblPr/>
@@ -12148,7 +11829,6 @@
     </w:tcPr>
     <w:tblStylePr w:type="firstRow">
       <w:rPr>
-        <w:rFonts w:ascii="Arial" w:eastAsia="Arial" w:hAnsi="Arial" w:cs="Arial"/>
         <w:b/>
         <w:bCs/>
       </w:rPr>
@@ -12159,7 +11839,6 @@
     </w:tblStylePr>
     <w:tblStylePr w:type="lastRow">
       <w:rPr>
-        <w:rFonts w:ascii="Arial" w:eastAsia="Arial" w:hAnsi="Arial" w:cs="Arial"/>
         <w:b/>
         <w:bCs/>
         <w:color w:val="000000" w:themeColor="text1"/>
@@ -12171,7 +11850,6 @@
     </w:tblStylePr>
     <w:tblStylePr w:type="firstCol">
       <w:rPr>
-        <w:rFonts w:ascii="Arial" w:eastAsia="Arial" w:hAnsi="Arial" w:cs="Arial"/>
         <w:color w:val="FFFFFF" w:themeColor="background1"/>
       </w:rPr>
       <w:tblPr/>
@@ -12181,7 +11859,6 @@
     </w:tblStylePr>
     <w:tblStylePr w:type="lastCol">
       <w:rPr>
-        <w:rFonts w:ascii="Arial" w:eastAsia="Arial" w:hAnsi="Arial" w:cs="Arial"/>
         <w:color w:val="FFFFFF" w:themeColor="background1"/>
       </w:rPr>
       <w:tblPr/>
@@ -12225,7 +11902,6 @@
     </w:tcPr>
     <w:tblStylePr w:type="firstRow">
       <w:rPr>
-        <w:rFonts w:ascii="Arial" w:eastAsia="Arial" w:hAnsi="Arial" w:cs="Arial"/>
         <w:b/>
         <w:bCs/>
       </w:rPr>
@@ -12236,7 +11912,6 @@
     </w:tblStylePr>
     <w:tblStylePr w:type="lastRow">
       <w:rPr>
-        <w:rFonts w:ascii="Arial" w:eastAsia="Arial" w:hAnsi="Arial" w:cs="Arial"/>
         <w:b/>
         <w:bCs/>
         <w:color w:val="000000" w:themeColor="text1"/>
@@ -12248,7 +11923,6 @@
     </w:tblStylePr>
     <w:tblStylePr w:type="firstCol">
       <w:rPr>
-        <w:rFonts w:ascii="Arial" w:eastAsia="Arial" w:hAnsi="Arial" w:cs="Arial"/>
         <w:color w:val="FFFFFF" w:themeColor="background1"/>
       </w:rPr>
       <w:tblPr/>
@@ -12258,7 +11932,6 @@
     </w:tblStylePr>
     <w:tblStylePr w:type="lastCol">
       <w:rPr>
-        <w:rFonts w:ascii="Arial" w:eastAsia="Arial" w:hAnsi="Arial" w:cs="Arial"/>
         <w:color w:val="FFFFFF" w:themeColor="background1"/>
       </w:rPr>
       <w:tblPr/>
@@ -12278,6 +11951,45 @@
         <w:shd w:val="clear" w:color="auto" w:fill="FBCAA2" w:themeFill="accent6" w:themeFillTint="7F"/>
       </w:tcPr>
     </w:tblStylePr>
+  </w:style>
+  <w:style w:type="paragraph" w:styleId="CommentText">
+    <w:name w:val="annotation text"/>
+    <w:basedOn w:val="Normal"/>
+    <w:link w:val="CommentTextChar"/>
+    <w:uiPriority w:val="99"/>
+    <w:semiHidden/>
+    <w:unhideWhenUsed/>
+    <w:pPr>
+      <w:spacing w:line="240" w:lineRule="auto"/>
+    </w:pPr>
+    <w:rPr>
+      <w:sz w:val="20"/>
+      <w:szCs w:val="20"/>
+    </w:rPr>
+  </w:style>
+  <w:style w:type="character" w:customStyle="1" w:styleId="CommentTextChar">
+    <w:name w:val="Comment Text Char"/>
+    <w:basedOn w:val="DefaultParagraphFont"/>
+    <w:link w:val="CommentText"/>
+    <w:uiPriority w:val="99"/>
+    <w:semiHidden/>
+    <w:rPr>
+      <w:rFonts w:ascii="Arial" w:hAnsi="Arial"/>
+      <w:color w:val="000000"/>
+      <w:sz w:val="20"/>
+      <w:szCs w:val="20"/>
+    </w:rPr>
+  </w:style>
+  <w:style w:type="character" w:styleId="CommentReference">
+    <w:name w:val="annotation reference"/>
+    <w:basedOn w:val="DefaultParagraphFont"/>
+    <w:uiPriority w:val="99"/>
+    <w:semiHidden/>
+    <w:unhideWhenUsed/>
+    <w:rPr>
+      <w:sz w:val="16"/>
+      <w:szCs w:val="16"/>
+    </w:rPr>
   </w:style>
 </w:styles>
 </file>
@@ -12325,7 +12037,7 @@
     </a:clrScheme>
     <a:fontScheme name="Office">
       <a:majorFont>
-        <a:latin typeface="Arial"/>
+        <a:latin typeface="Calibri"/>
         <a:ea typeface=""/>
         <a:cs typeface=""/>
         <a:font script="Jpan" typeface="ＭＳ ゴシック"/>
@@ -12360,7 +12072,7 @@
         <a:font script="Geor" typeface="Sylfaen"/>
       </a:majorFont>
       <a:minorFont>
-        <a:latin typeface="Arial"/>
+        <a:latin typeface="Cambria"/>
         <a:ea typeface=""/>
         <a:cs typeface=""/>
         <a:font script="Jpan" typeface="ＭＳ 明朝"/>

</xml_diff>